<commit_message>
Stack Problem Solved - Asteroids (all about if else)
</commit_message>
<xml_diff>
--- a/Stack.docx
+++ b/Stack.docx
@@ -7145,6 +7145,1996 @@
         </w:rPr>
         <w:t>}</w:t>
       </w:r>
+    </w:p>
+    <w:p>
+      <w:pPr>
+        <w:rPr>
+          <w:lang w:val="en-PK"/>
+        </w:rPr>
+      </w:pPr>
+      <w:hyperlink r:id="rId11" w:history="1">
+        <w:r>
+          <w:rPr>
+            <w:rStyle w:val="Hyperlink"/>
+            <w:b/>
+            <w:bCs/>
+          </w:rPr>
+          <w:t>Asteroid Collision</w:t>
+        </w:r>
+      </w:hyperlink>
+    </w:p>
+    <w:p>
+      <w:pPr>
+        <w:pStyle w:val="ListParagraph"/>
+        <w:numPr>
+          <w:ilvl w:val="0"/>
+          <w:numId w:val="7"/>
+        </w:numPr>
+        <w:rPr>
+          <w:lang w:val="en-PK"/>
+        </w:rPr>
+      </w:pPr>
+      <w:r>
+        <w:rPr>
+          <w:lang w:val="en-PK"/>
+        </w:rPr>
+        <w:t>All about if else</w:t>
+      </w:r>
+    </w:p>
+    <w:p>
+      <w:pPr>
+        <w:pStyle w:val="ListParagraph"/>
+        <w:numPr>
+          <w:ilvl w:val="0"/>
+          <w:numId w:val="7"/>
+        </w:numPr>
+        <w:rPr>
+          <w:lang w:val="en-PK"/>
+        </w:rPr>
+      </w:pPr>
+      <w:r>
+        <w:rPr>
+          <w:lang w:val="en-PK"/>
+        </w:rPr>
+        <w:t>When to pop</w:t>
+      </w:r>
+      <w:r>
+        <w:rPr>
+          <w:lang w:val="en-PK"/>
+        </w:rPr>
+        <w:br/>
+        <w:t>Only pop when negative numbers</w:t>
+      </w:r>
+    </w:p>
+    <w:p>
+      <w:pPr>
+        <w:pStyle w:val="ListParagraph"/>
+        <w:numPr>
+          <w:ilvl w:val="0"/>
+          <w:numId w:val="7"/>
+        </w:numPr>
+        <w:rPr>
+          <w:lang w:val="en-PK"/>
+        </w:rPr>
+      </w:pPr>
+      <w:r>
+        <w:rPr>
+          <w:lang w:val="en-PK"/>
+        </w:rPr>
+        <w:t>1 2 3 4 5 6 in stack, number occur like -9, all these will be removed</w:t>
+      </w:r>
+    </w:p>
+    <w:p>
+      <w:pPr>
+        <w:pStyle w:val="ListParagraph"/>
+        <w:numPr>
+          <w:ilvl w:val="0"/>
+          <w:numId w:val="7"/>
+        </w:numPr>
+        <w:rPr>
+          <w:lang w:val="en-PK"/>
+        </w:rPr>
+      </w:pPr>
+      <w:r>
+        <w:rPr>
+          <w:lang w:val="en-PK"/>
+        </w:rPr>
+        <w:t>1 -1, both deduct</w:t>
+      </w:r>
+    </w:p>
+    <w:p>
+      <w:pPr>
+        <w:pStyle w:val="ListParagraph"/>
+        <w:numPr>
+          <w:ilvl w:val="0"/>
+          <w:numId w:val="7"/>
+        </w:numPr>
+        <w:rPr>
+          <w:lang w:val="en-PK"/>
+        </w:rPr>
+      </w:pPr>
+      <w:r>
+        <w:rPr>
+          <w:lang w:val="en-PK"/>
+        </w:rPr>
+        <w:t>1 -2 -2 -2, -&gt; -2 -2 -2 is result as 1 cancelled</w:t>
+      </w:r>
+    </w:p>
+    <w:p>
+      <w:pPr>
+        <w:rPr>
+          <w:lang w:val="en-PK"/>
+        </w:rPr>
+      </w:pPr>
+      <w:r>
+        <w:rPr>
+          <w:lang w:val="en-PK"/>
+        </w:rPr>
+        <w:t>class Solution {</w:t>
+      </w:r>
+    </w:p>
+    <w:p>
+      <w:pPr>
+        <w:rPr>
+          <w:lang w:val="en-PK"/>
+        </w:rPr>
+      </w:pPr>
+      <w:r>
+        <w:rPr>
+          <w:lang w:val="en-PK"/>
+        </w:rPr>
+        <w:t xml:space="preserve">    public </w:t>
+      </w:r>
+      <w:proofErr w:type="gramStart"/>
+      <w:r>
+        <w:rPr>
+          <w:lang w:val="en-PK"/>
+        </w:rPr>
+        <w:t>int[</w:t>
+      </w:r>
+      <w:proofErr w:type="gramEnd"/>
+      <w:r>
+        <w:rPr>
+          <w:lang w:val="en-PK"/>
+        </w:rPr>
+        <w:t xml:space="preserve">] </w:t>
+      </w:r>
+      <w:proofErr w:type="spellStart"/>
+      <w:r>
+        <w:rPr>
+          <w:lang w:val="en-PK"/>
+        </w:rPr>
+        <w:t>asteroidCollision</w:t>
+      </w:r>
+      <w:proofErr w:type="spellEnd"/>
+      <w:r>
+        <w:rPr>
+          <w:lang w:val="en-PK"/>
+        </w:rPr>
+        <w:t>(int[] asteroids) {</w:t>
+      </w:r>
+    </w:p>
+    <w:p>
+      <w:pPr>
+        <w:rPr>
+          <w:lang w:val="en-PK"/>
+        </w:rPr>
+      </w:pPr>
+      <w:r>
+        <w:rPr>
+          <w:lang w:val="en-PK"/>
+        </w:rPr>
+        <w:t>        Stack&lt;Integer&gt; data = new Stack&lt;Integer</w:t>
+      </w:r>
+      <w:proofErr w:type="gramStart"/>
+      <w:r>
+        <w:rPr>
+          <w:lang w:val="en-PK"/>
+        </w:rPr>
+        <w:t>&gt;(</w:t>
+      </w:r>
+      <w:proofErr w:type="gramEnd"/>
+      <w:r>
+        <w:rPr>
+          <w:lang w:val="en-PK"/>
+        </w:rPr>
+        <w:t>);</w:t>
+      </w:r>
+    </w:p>
+    <w:p>
+      <w:pPr>
+        <w:rPr>
+          <w:lang w:val="en-PK"/>
+        </w:rPr>
+      </w:pPr>
+      <w:r>
+        <w:rPr>
+          <w:lang w:val="en-PK"/>
+        </w:rPr>
+        <w:t xml:space="preserve">        // element negative then ap stack se </w:t>
+      </w:r>
+      <w:proofErr w:type="spellStart"/>
+      <w:r>
+        <w:rPr>
+          <w:lang w:val="en-PK"/>
+        </w:rPr>
+        <w:t>nikalo</w:t>
+      </w:r>
+      <w:proofErr w:type="spellEnd"/>
+    </w:p>
+    <w:p>
+      <w:pPr>
+        <w:rPr>
+          <w:lang w:val="en-PK"/>
+        </w:rPr>
+      </w:pPr>
+      <w:r>
+        <w:rPr>
+          <w:lang w:val="en-PK"/>
+        </w:rPr>
+        <w:t xml:space="preserve">        </w:t>
+      </w:r>
+      <w:proofErr w:type="spellStart"/>
+      <w:proofErr w:type="gramStart"/>
+      <w:r>
+        <w:rPr>
+          <w:lang w:val="en-PK"/>
+        </w:rPr>
+        <w:t>data.push</w:t>
+      </w:r>
+      <w:proofErr w:type="spellEnd"/>
+      <w:proofErr w:type="gramEnd"/>
+      <w:r>
+        <w:rPr>
+          <w:lang w:val="en-PK"/>
+        </w:rPr>
+        <w:t>(asteroids[0]);</w:t>
+      </w:r>
+    </w:p>
+    <w:p>
+      <w:pPr>
+        <w:rPr>
+          <w:lang w:val="en-PK"/>
+        </w:rPr>
+      </w:pPr>
+      <w:r>
+        <w:rPr>
+          <w:lang w:val="en-PK"/>
+        </w:rPr>
+        <w:t xml:space="preserve">        </w:t>
+      </w:r>
+    </w:p>
+    <w:p>
+      <w:pPr>
+        <w:rPr>
+          <w:lang w:val="en-PK"/>
+        </w:rPr>
+      </w:pPr>
+      <w:r>
+        <w:rPr>
+          <w:lang w:val="en-PK"/>
+        </w:rPr>
+        <w:t xml:space="preserve">        int n = </w:t>
+      </w:r>
+      <w:proofErr w:type="spellStart"/>
+      <w:proofErr w:type="gramStart"/>
+      <w:r>
+        <w:rPr>
+          <w:lang w:val="en-PK"/>
+        </w:rPr>
+        <w:t>asteroids.length</w:t>
+      </w:r>
+      <w:proofErr w:type="spellEnd"/>
+      <w:proofErr w:type="gramEnd"/>
+      <w:r>
+        <w:rPr>
+          <w:lang w:val="en-PK"/>
+        </w:rPr>
+        <w:t>;</w:t>
+      </w:r>
+    </w:p>
+    <w:p>
+      <w:pPr>
+        <w:rPr>
+          <w:lang w:val="en-PK"/>
+        </w:rPr>
+      </w:pPr>
+    </w:p>
+    <w:p>
+      <w:pPr>
+        <w:rPr>
+          <w:lang w:val="en-PK"/>
+        </w:rPr>
+      </w:pPr>
+      <w:r>
+        <w:rPr>
+          <w:lang w:val="en-PK"/>
+        </w:rPr>
+        <w:t>        // All is about IF ELSE</w:t>
+      </w:r>
+    </w:p>
+    <w:p>
+      <w:pPr>
+        <w:rPr>
+          <w:lang w:val="en-PK"/>
+        </w:rPr>
+      </w:pPr>
+    </w:p>
+    <w:p>
+      <w:pPr>
+        <w:rPr>
+          <w:lang w:val="en-PK"/>
+        </w:rPr>
+      </w:pPr>
+      <w:r>
+        <w:rPr>
+          <w:lang w:val="en-PK"/>
+        </w:rPr>
+        <w:t xml:space="preserve">        </w:t>
+      </w:r>
+      <w:proofErr w:type="gramStart"/>
+      <w:r>
+        <w:rPr>
+          <w:lang w:val="en-PK"/>
+        </w:rPr>
+        <w:t>for( int</w:t>
+      </w:r>
+      <w:proofErr w:type="gramEnd"/>
+      <w:r>
+        <w:rPr>
+          <w:lang w:val="en-PK"/>
+        </w:rPr>
+        <w:t xml:space="preserve"> </w:t>
+      </w:r>
+      <w:proofErr w:type="spellStart"/>
+      <w:r>
+        <w:rPr>
+          <w:lang w:val="en-PK"/>
+        </w:rPr>
+        <w:t>i</w:t>
+      </w:r>
+      <w:proofErr w:type="spellEnd"/>
+      <w:r>
+        <w:rPr>
+          <w:lang w:val="en-PK"/>
+        </w:rPr>
+        <w:t xml:space="preserve">=1; </w:t>
+      </w:r>
+      <w:proofErr w:type="spellStart"/>
+      <w:r>
+        <w:rPr>
+          <w:lang w:val="en-PK"/>
+        </w:rPr>
+        <w:t>i</w:t>
+      </w:r>
+      <w:proofErr w:type="spellEnd"/>
+      <w:r>
+        <w:rPr>
+          <w:lang w:val="en-PK"/>
+        </w:rPr>
+        <w:t xml:space="preserve">&lt;n ; </w:t>
+      </w:r>
+      <w:proofErr w:type="spellStart"/>
+      <w:r>
+        <w:rPr>
+          <w:lang w:val="en-PK"/>
+        </w:rPr>
+        <w:t>i</w:t>
+      </w:r>
+      <w:proofErr w:type="spellEnd"/>
+      <w:r>
+        <w:rPr>
+          <w:lang w:val="en-PK"/>
+        </w:rPr>
+        <w:t>+=1)</w:t>
+      </w:r>
+    </w:p>
+    <w:p>
+      <w:pPr>
+        <w:rPr>
+          <w:lang w:val="en-PK"/>
+        </w:rPr>
+      </w:pPr>
+      <w:r>
+        <w:rPr>
+          <w:lang w:val="en-PK"/>
+        </w:rPr>
+        <w:t xml:space="preserve">        { </w:t>
+      </w:r>
+    </w:p>
+    <w:p>
+      <w:pPr>
+        <w:rPr>
+          <w:lang w:val="en-PK"/>
+        </w:rPr>
+      </w:pPr>
+      <w:r>
+        <w:rPr>
+          <w:lang w:val="en-PK"/>
+        </w:rPr>
+        <w:t xml:space="preserve">            if </w:t>
+      </w:r>
+      <w:proofErr w:type="gramStart"/>
+      <w:r>
+        <w:rPr>
+          <w:lang w:val="en-PK"/>
+        </w:rPr>
+        <w:t>( asteroids</w:t>
+      </w:r>
+      <w:proofErr w:type="gramEnd"/>
+      <w:r>
+        <w:rPr>
+          <w:lang w:val="en-PK"/>
+        </w:rPr>
+        <w:t>[</w:t>
+      </w:r>
+      <w:proofErr w:type="spellStart"/>
+      <w:r>
+        <w:rPr>
+          <w:lang w:val="en-PK"/>
+        </w:rPr>
+        <w:t>i</w:t>
+      </w:r>
+      <w:proofErr w:type="spellEnd"/>
+      <w:r>
+        <w:rPr>
+          <w:lang w:val="en-PK"/>
+        </w:rPr>
+        <w:t xml:space="preserve">] &lt; 0) </w:t>
+      </w:r>
+    </w:p>
+    <w:p>
+      <w:pPr>
+        <w:rPr>
+          <w:lang w:val="en-PK"/>
+        </w:rPr>
+      </w:pPr>
+      <w:r>
+        <w:rPr>
+          <w:lang w:val="en-PK"/>
+        </w:rPr>
+        <w:lastRenderedPageBreak/>
+        <w:t>            {</w:t>
+      </w:r>
+    </w:p>
+    <w:p>
+      <w:pPr>
+        <w:rPr>
+          <w:lang w:val="en-PK"/>
+        </w:rPr>
+      </w:pPr>
+    </w:p>
+    <w:p>
+      <w:pPr>
+        <w:rPr>
+          <w:lang w:val="en-PK"/>
+        </w:rPr>
+      </w:pPr>
+      <w:r>
+        <w:rPr>
+          <w:lang w:val="en-PK"/>
+        </w:rPr>
+        <w:t xml:space="preserve">                    // </w:t>
+      </w:r>
+      <w:proofErr w:type="spellStart"/>
+      <w:r>
+        <w:rPr>
+          <w:lang w:val="en-PK"/>
+        </w:rPr>
+        <w:t>ast</w:t>
+      </w:r>
+      <w:proofErr w:type="spellEnd"/>
+      <w:r>
+        <w:rPr>
+          <w:lang w:val="en-PK"/>
+        </w:rPr>
+        <w:t xml:space="preserve"> is </w:t>
+      </w:r>
+      <w:proofErr w:type="spellStart"/>
+      <w:r>
+        <w:rPr>
+          <w:lang w:val="en-PK"/>
+        </w:rPr>
+        <w:t>postive</w:t>
+      </w:r>
+      <w:proofErr w:type="spellEnd"/>
+      <w:r>
+        <w:rPr>
+          <w:lang w:val="en-PK"/>
+        </w:rPr>
+        <w:t xml:space="preserve"> so its same numbers will be less than like negative</w:t>
+      </w:r>
+    </w:p>
+    <w:p>
+      <w:pPr>
+        <w:rPr>
+          <w:lang w:val="en-PK"/>
+        </w:rPr>
+      </w:pPr>
+    </w:p>
+    <w:p>
+      <w:pPr>
+        <w:rPr>
+          <w:lang w:val="en-PK"/>
+        </w:rPr>
+      </w:pPr>
+      <w:r>
+        <w:rPr>
+          <w:lang w:val="en-PK"/>
+        </w:rPr>
+        <w:t>                     </w:t>
+      </w:r>
+      <w:proofErr w:type="gramStart"/>
+      <w:r>
+        <w:rPr>
+          <w:lang w:val="en-PK"/>
+        </w:rPr>
+        <w:t xml:space="preserve">if( </w:t>
+      </w:r>
+      <w:proofErr w:type="spellStart"/>
+      <w:r>
+        <w:rPr>
+          <w:lang w:val="en-PK"/>
+        </w:rPr>
+        <w:t>data</w:t>
+      </w:r>
+      <w:proofErr w:type="gramEnd"/>
+      <w:r>
+        <w:rPr>
+          <w:lang w:val="en-PK"/>
+        </w:rPr>
+        <w:t>.isEmpty</w:t>
+      </w:r>
+      <w:proofErr w:type="spellEnd"/>
+      <w:r>
+        <w:rPr>
+          <w:lang w:val="en-PK"/>
+        </w:rPr>
+        <w:t>() ){</w:t>
+      </w:r>
+    </w:p>
+    <w:p>
+      <w:pPr>
+        <w:rPr>
+          <w:lang w:val="en-PK"/>
+        </w:rPr>
+      </w:pPr>
+      <w:r>
+        <w:rPr>
+          <w:lang w:val="en-PK"/>
+        </w:rPr>
+        <w:t>                         </w:t>
+      </w:r>
+      <w:proofErr w:type="spellStart"/>
+      <w:proofErr w:type="gramStart"/>
+      <w:r>
+        <w:rPr>
+          <w:lang w:val="en-PK"/>
+        </w:rPr>
+        <w:t>data.push</w:t>
+      </w:r>
+      <w:proofErr w:type="spellEnd"/>
+      <w:proofErr w:type="gramEnd"/>
+      <w:r>
+        <w:rPr>
+          <w:lang w:val="en-PK"/>
+        </w:rPr>
+        <w:t>(asteroids[</w:t>
+      </w:r>
+      <w:proofErr w:type="spellStart"/>
+      <w:r>
+        <w:rPr>
+          <w:lang w:val="en-PK"/>
+        </w:rPr>
+        <w:t>i</w:t>
+      </w:r>
+      <w:proofErr w:type="spellEnd"/>
+      <w:r>
+        <w:rPr>
+          <w:lang w:val="en-PK"/>
+        </w:rPr>
+        <w:t>]); // negative along with negative numbers</w:t>
+      </w:r>
+    </w:p>
+    <w:p>
+      <w:pPr>
+        <w:rPr>
+          <w:lang w:val="en-PK"/>
+        </w:rPr>
+      </w:pPr>
+      <w:r>
+        <w:rPr>
+          <w:lang w:val="en-PK"/>
+        </w:rPr>
+        <w:t>                         continue;</w:t>
+      </w:r>
+    </w:p>
+    <w:p>
+      <w:pPr>
+        <w:rPr>
+          <w:lang w:val="en-PK"/>
+        </w:rPr>
+      </w:pPr>
+      <w:r>
+        <w:rPr>
+          <w:lang w:val="en-PK"/>
+        </w:rPr>
+        <w:t>                    }</w:t>
+      </w:r>
+    </w:p>
+    <w:p>
+      <w:pPr>
+        <w:rPr>
+          <w:lang w:val="en-PK"/>
+        </w:rPr>
+      </w:pPr>
+    </w:p>
+    <w:p>
+      <w:pPr>
+        <w:rPr>
+          <w:lang w:val="en-PK"/>
+        </w:rPr>
+      </w:pPr>
+      <w:r>
+        <w:rPr>
+          <w:lang w:val="en-PK"/>
+        </w:rPr>
+        <w:t xml:space="preserve">                    </w:t>
+      </w:r>
+      <w:proofErr w:type="gramStart"/>
+      <w:r>
+        <w:rPr>
+          <w:lang w:val="en-PK"/>
+        </w:rPr>
+        <w:t>if( !</w:t>
+      </w:r>
+      <w:proofErr w:type="spellStart"/>
+      <w:proofErr w:type="gramEnd"/>
+      <w:r>
+        <w:rPr>
+          <w:lang w:val="en-PK"/>
+        </w:rPr>
+        <w:t>data.isEmpty</w:t>
+      </w:r>
+      <w:proofErr w:type="spellEnd"/>
+      <w:r>
+        <w:rPr>
+          <w:lang w:val="en-PK"/>
+        </w:rPr>
+        <w:t xml:space="preserve">() &amp;&amp; </w:t>
+      </w:r>
+      <w:proofErr w:type="spellStart"/>
+      <w:r>
+        <w:rPr>
+          <w:lang w:val="en-PK"/>
+        </w:rPr>
+        <w:t>data.peek</w:t>
+      </w:r>
+      <w:proofErr w:type="spellEnd"/>
+      <w:r>
+        <w:rPr>
+          <w:lang w:val="en-PK"/>
+        </w:rPr>
+        <w:t>() &lt; 0 ){</w:t>
+      </w:r>
+    </w:p>
+    <w:p>
+      <w:pPr>
+        <w:rPr>
+          <w:lang w:val="en-PK"/>
+        </w:rPr>
+      </w:pPr>
+      <w:r>
+        <w:rPr>
+          <w:lang w:val="en-PK"/>
+        </w:rPr>
+        <w:t xml:space="preserve">                        </w:t>
+      </w:r>
+      <w:proofErr w:type="spellStart"/>
+      <w:proofErr w:type="gramStart"/>
+      <w:r>
+        <w:rPr>
+          <w:lang w:val="en-PK"/>
+        </w:rPr>
+        <w:t>data.push</w:t>
+      </w:r>
+      <w:proofErr w:type="spellEnd"/>
+      <w:proofErr w:type="gramEnd"/>
+      <w:r>
+        <w:rPr>
+          <w:lang w:val="en-PK"/>
+        </w:rPr>
+        <w:t>(asteroids[</w:t>
+      </w:r>
+      <w:proofErr w:type="spellStart"/>
+      <w:r>
+        <w:rPr>
+          <w:lang w:val="en-PK"/>
+        </w:rPr>
+        <w:t>i</w:t>
+      </w:r>
+      <w:proofErr w:type="spellEnd"/>
+      <w:r>
+        <w:rPr>
+          <w:lang w:val="en-PK"/>
+        </w:rPr>
+        <w:t>]); // negative along with negative numbers</w:t>
+      </w:r>
+    </w:p>
+    <w:p>
+      <w:pPr>
+        <w:rPr>
+          <w:lang w:val="en-PK"/>
+        </w:rPr>
+      </w:pPr>
+      <w:r>
+        <w:rPr>
+          <w:lang w:val="en-PK"/>
+        </w:rPr>
+        <w:t>                        continue;</w:t>
+      </w:r>
+    </w:p>
+    <w:p>
+      <w:pPr>
+        <w:rPr>
+          <w:lang w:val="en-PK"/>
+        </w:rPr>
+      </w:pPr>
+      <w:r>
+        <w:rPr>
+          <w:lang w:val="en-PK"/>
+        </w:rPr>
+        <w:t xml:space="preserve">                </w:t>
+      </w:r>
+    </w:p>
+    <w:p>
+      <w:pPr>
+        <w:rPr>
+          <w:lang w:val="en-PK"/>
+        </w:rPr>
+      </w:pPr>
+      <w:r>
+        <w:rPr>
+          <w:lang w:val="en-PK"/>
+        </w:rPr>
+        <w:t>                    }</w:t>
+      </w:r>
+    </w:p>
+    <w:p>
+      <w:pPr>
+        <w:rPr>
+          <w:lang w:val="en-PK"/>
+        </w:rPr>
+      </w:pPr>
+    </w:p>
+    <w:p>
+      <w:pPr>
+        <w:rPr>
+          <w:lang w:val="en-PK"/>
+        </w:rPr>
+      </w:pPr>
+      <w:r>
+        <w:rPr>
+          <w:lang w:val="en-PK"/>
+        </w:rPr>
+        <w:t>                   </w:t>
+      </w:r>
+    </w:p>
+    <w:p>
+      <w:pPr>
+        <w:rPr>
+          <w:lang w:val="en-PK"/>
+        </w:rPr>
+      </w:pPr>
+    </w:p>
+    <w:p>
+      <w:pPr>
+        <w:rPr>
+          <w:lang w:val="en-PK"/>
+        </w:rPr>
+      </w:pPr>
+      <w:r>
+        <w:rPr>
+          <w:lang w:val="en-PK"/>
+        </w:rPr>
+        <w:t xml:space="preserve">                    int </w:t>
+      </w:r>
+      <w:proofErr w:type="spellStart"/>
+      <w:r>
+        <w:rPr>
+          <w:lang w:val="en-PK"/>
+        </w:rPr>
+        <w:t>ast</w:t>
+      </w:r>
+      <w:proofErr w:type="spellEnd"/>
+      <w:r>
+        <w:rPr>
+          <w:lang w:val="en-PK"/>
+        </w:rPr>
+        <w:t xml:space="preserve"> = -asteroids[</w:t>
+      </w:r>
+      <w:proofErr w:type="spellStart"/>
+      <w:r>
+        <w:rPr>
+          <w:lang w:val="en-PK"/>
+        </w:rPr>
+        <w:t>i</w:t>
+      </w:r>
+      <w:proofErr w:type="spellEnd"/>
+      <w:r>
+        <w:rPr>
+          <w:lang w:val="en-PK"/>
+        </w:rPr>
+        <w:t>];</w:t>
+      </w:r>
+    </w:p>
+    <w:p>
+      <w:pPr>
+        <w:rPr>
+          <w:lang w:val="en-PK"/>
+        </w:rPr>
+      </w:pPr>
+    </w:p>
+    <w:p>
+      <w:pPr>
+        <w:rPr>
+          <w:lang w:val="en-PK"/>
+        </w:rPr>
+      </w:pPr>
+      <w:r>
+        <w:rPr>
+          <w:lang w:val="en-PK"/>
+        </w:rPr>
+        <w:t xml:space="preserve">                    </w:t>
+      </w:r>
+      <w:proofErr w:type="gramStart"/>
+      <w:r>
+        <w:rPr>
+          <w:lang w:val="en-PK"/>
+        </w:rPr>
+        <w:t>if( !</w:t>
+      </w:r>
+      <w:proofErr w:type="spellStart"/>
+      <w:proofErr w:type="gramEnd"/>
+      <w:r>
+        <w:rPr>
+          <w:lang w:val="en-PK"/>
+        </w:rPr>
+        <w:t>data.isEmpty</w:t>
+      </w:r>
+      <w:proofErr w:type="spellEnd"/>
+      <w:r>
+        <w:rPr>
+          <w:lang w:val="en-PK"/>
+        </w:rPr>
+        <w:t>() &amp;&amp;  </w:t>
+      </w:r>
+      <w:proofErr w:type="spellStart"/>
+      <w:r>
+        <w:rPr>
+          <w:lang w:val="en-PK"/>
+        </w:rPr>
+        <w:t>data.peek</w:t>
+      </w:r>
+      <w:proofErr w:type="spellEnd"/>
+      <w:r>
+        <w:rPr>
+          <w:lang w:val="en-PK"/>
+        </w:rPr>
+        <w:t>() == asteroids[</w:t>
+      </w:r>
+      <w:proofErr w:type="spellStart"/>
+      <w:r>
+        <w:rPr>
+          <w:lang w:val="en-PK"/>
+        </w:rPr>
+        <w:t>i</w:t>
+      </w:r>
+      <w:proofErr w:type="spellEnd"/>
+      <w:r>
+        <w:rPr>
+          <w:lang w:val="en-PK"/>
+        </w:rPr>
+        <w:t>] ){</w:t>
+      </w:r>
+    </w:p>
+    <w:p>
+      <w:pPr>
+        <w:rPr>
+          <w:lang w:val="en-PK"/>
+        </w:rPr>
+      </w:pPr>
+      <w:r>
+        <w:rPr>
+          <w:lang w:val="en-PK"/>
+        </w:rPr>
+        <w:t xml:space="preserve">                        </w:t>
+      </w:r>
+      <w:proofErr w:type="spellStart"/>
+      <w:proofErr w:type="gramStart"/>
+      <w:r>
+        <w:rPr>
+          <w:lang w:val="en-PK"/>
+        </w:rPr>
+        <w:t>data.pop</w:t>
+      </w:r>
+      <w:proofErr w:type="spellEnd"/>
+      <w:r>
+        <w:rPr>
+          <w:lang w:val="en-PK"/>
+        </w:rPr>
+        <w:t>(</w:t>
+      </w:r>
+      <w:proofErr w:type="gramEnd"/>
+      <w:r>
+        <w:rPr>
+          <w:lang w:val="en-PK"/>
+        </w:rPr>
+        <w:t>);</w:t>
+      </w:r>
+    </w:p>
+    <w:p>
+      <w:pPr>
+        <w:rPr>
+          <w:lang w:val="en-PK"/>
+        </w:rPr>
+      </w:pPr>
+      <w:r>
+        <w:rPr>
+          <w:lang w:val="en-PK"/>
+        </w:rPr>
+        <w:t>                        continue;</w:t>
+      </w:r>
+    </w:p>
+    <w:p>
+      <w:pPr>
+        <w:rPr>
+          <w:lang w:val="en-PK"/>
+        </w:rPr>
+      </w:pPr>
+      <w:r>
+        <w:rPr>
+          <w:lang w:val="en-PK"/>
+        </w:rPr>
+        <w:t>                    }</w:t>
+      </w:r>
+    </w:p>
+    <w:p>
+      <w:pPr>
+        <w:rPr>
+          <w:lang w:val="en-PK"/>
+        </w:rPr>
+      </w:pPr>
+      <w:r>
+        <w:rPr>
+          <w:lang w:val="en-PK"/>
+        </w:rPr>
+        <w:t>                     </w:t>
+      </w:r>
+    </w:p>
+    <w:p>
+      <w:pPr>
+        <w:rPr>
+          <w:lang w:val="en-PK"/>
+        </w:rPr>
+      </w:pPr>
+      <w:r>
+        <w:rPr>
+          <w:lang w:val="en-PK"/>
+        </w:rPr>
+        <w:t xml:space="preserve">                    </w:t>
+      </w:r>
+    </w:p>
+    <w:p>
+      <w:pPr>
+        <w:rPr>
+          <w:lang w:val="en-PK"/>
+        </w:rPr>
+      </w:pPr>
+    </w:p>
+    <w:p>
+      <w:pPr>
+        <w:rPr>
+          <w:lang w:val="en-PK"/>
+        </w:rPr>
+      </w:pPr>
+      <w:r>
+        <w:rPr>
+          <w:lang w:val="en-PK"/>
+        </w:rPr>
+        <w:t xml:space="preserve">                  </w:t>
+      </w:r>
+    </w:p>
+    <w:p>
+      <w:pPr>
+        <w:rPr>
+          <w:lang w:val="en-PK"/>
+        </w:rPr>
+      </w:pPr>
+    </w:p>
+    <w:p>
+      <w:pPr>
+        <w:rPr>
+          <w:lang w:val="en-PK"/>
+        </w:rPr>
+      </w:pPr>
+      <w:r>
+        <w:rPr>
+          <w:lang w:val="en-PK"/>
+        </w:rPr>
+        <w:t>                   </w:t>
+      </w:r>
+    </w:p>
+    <w:p>
+      <w:pPr>
+        <w:rPr>
+          <w:lang w:val="en-PK"/>
+        </w:rPr>
+      </w:pPr>
+      <w:r>
+        <w:rPr>
+          <w:lang w:val="en-PK"/>
+        </w:rPr>
+        <w:t xml:space="preserve">                    </w:t>
+      </w:r>
+    </w:p>
+    <w:p>
+      <w:pPr>
+        <w:rPr>
+          <w:lang w:val="en-PK"/>
+        </w:rPr>
+      </w:pPr>
+    </w:p>
+    <w:p>
+      <w:pPr>
+        <w:rPr>
+          <w:lang w:val="en-PK"/>
+        </w:rPr>
+      </w:pPr>
+      <w:r>
+        <w:rPr>
+          <w:lang w:val="en-PK"/>
+        </w:rPr>
+        <w:t>                    // handling numbers less than negative number</w:t>
+      </w:r>
+    </w:p>
+    <w:p>
+      <w:pPr>
+        <w:rPr>
+          <w:lang w:val="en-PK"/>
+        </w:rPr>
+      </w:pPr>
+      <w:r>
+        <w:rPr>
+          <w:lang w:val="en-PK"/>
+        </w:rPr>
+        <w:t xml:space="preserve">                    while </w:t>
+      </w:r>
+      <w:proofErr w:type="gramStart"/>
+      <w:r>
+        <w:rPr>
+          <w:lang w:val="en-PK"/>
+        </w:rPr>
+        <w:t>( !</w:t>
+      </w:r>
+      <w:proofErr w:type="spellStart"/>
+      <w:r>
+        <w:rPr>
+          <w:lang w:val="en-PK"/>
+        </w:rPr>
+        <w:t>data</w:t>
+      </w:r>
+      <w:proofErr w:type="gramEnd"/>
+      <w:r>
+        <w:rPr>
+          <w:lang w:val="en-PK"/>
+        </w:rPr>
+        <w:t>.isEmpty</w:t>
+      </w:r>
+      <w:proofErr w:type="spellEnd"/>
+      <w:r>
+        <w:rPr>
+          <w:lang w:val="en-PK"/>
+        </w:rPr>
+        <w:t xml:space="preserve">() &amp;&amp; </w:t>
+      </w:r>
+      <w:proofErr w:type="spellStart"/>
+      <w:r>
+        <w:rPr>
+          <w:lang w:val="en-PK"/>
+        </w:rPr>
+        <w:t>data.peek</w:t>
+      </w:r>
+      <w:proofErr w:type="spellEnd"/>
+      <w:r>
+        <w:rPr>
+          <w:lang w:val="en-PK"/>
+        </w:rPr>
+        <w:t xml:space="preserve">()&gt;0 &amp;&amp; </w:t>
+      </w:r>
+      <w:proofErr w:type="spellStart"/>
+      <w:r>
+        <w:rPr>
+          <w:lang w:val="en-PK"/>
+        </w:rPr>
+        <w:t>data.peek</w:t>
+      </w:r>
+      <w:proofErr w:type="spellEnd"/>
+      <w:r>
+        <w:rPr>
+          <w:lang w:val="en-PK"/>
+        </w:rPr>
+        <w:t xml:space="preserve">() &lt; </w:t>
+      </w:r>
+      <w:proofErr w:type="spellStart"/>
+      <w:r>
+        <w:rPr>
+          <w:lang w:val="en-PK"/>
+        </w:rPr>
+        <w:t>ast</w:t>
+      </w:r>
+      <w:proofErr w:type="spellEnd"/>
+      <w:r>
+        <w:rPr>
+          <w:lang w:val="en-PK"/>
+        </w:rPr>
+        <w:t xml:space="preserve"> ) {</w:t>
+      </w:r>
+    </w:p>
+    <w:p>
+      <w:pPr>
+        <w:rPr>
+          <w:lang w:val="en-PK"/>
+        </w:rPr>
+      </w:pPr>
+      <w:r>
+        <w:rPr>
+          <w:lang w:val="en-PK"/>
+        </w:rPr>
+        <w:t xml:space="preserve">                        </w:t>
+      </w:r>
+      <w:proofErr w:type="spellStart"/>
+      <w:proofErr w:type="gramStart"/>
+      <w:r>
+        <w:rPr>
+          <w:lang w:val="en-PK"/>
+        </w:rPr>
+        <w:t>data.pop</w:t>
+      </w:r>
+      <w:proofErr w:type="spellEnd"/>
+      <w:r>
+        <w:rPr>
+          <w:lang w:val="en-PK"/>
+        </w:rPr>
+        <w:t>(</w:t>
+      </w:r>
+      <w:proofErr w:type="gramEnd"/>
+      <w:r>
+        <w:rPr>
+          <w:lang w:val="en-PK"/>
+        </w:rPr>
+        <w:t>);</w:t>
+      </w:r>
+    </w:p>
+    <w:p>
+      <w:pPr>
+        <w:rPr>
+          <w:lang w:val="en-PK"/>
+        </w:rPr>
+      </w:pPr>
+      <w:r>
+        <w:rPr>
+          <w:lang w:val="en-PK"/>
+        </w:rPr>
+        <w:t>                    }</w:t>
+      </w:r>
+    </w:p>
+    <w:p>
+      <w:pPr>
+        <w:rPr>
+          <w:lang w:val="en-PK"/>
+        </w:rPr>
+      </w:pPr>
+    </w:p>
+    <w:p>
+      <w:pPr>
+        <w:rPr>
+          <w:lang w:val="en-PK"/>
+        </w:rPr>
+      </w:pPr>
+      <w:r>
+        <w:rPr>
+          <w:lang w:val="en-PK"/>
+        </w:rPr>
+        <w:t xml:space="preserve">                    </w:t>
+      </w:r>
+      <w:proofErr w:type="gramStart"/>
+      <w:r>
+        <w:rPr>
+          <w:lang w:val="en-PK"/>
+        </w:rPr>
+        <w:t xml:space="preserve">if( </w:t>
+      </w:r>
+      <w:proofErr w:type="spellStart"/>
+      <w:r>
+        <w:rPr>
+          <w:lang w:val="en-PK"/>
+        </w:rPr>
+        <w:t>data</w:t>
+      </w:r>
+      <w:proofErr w:type="gramEnd"/>
+      <w:r>
+        <w:rPr>
+          <w:lang w:val="en-PK"/>
+        </w:rPr>
+        <w:t>.isEmpty</w:t>
+      </w:r>
+      <w:proofErr w:type="spellEnd"/>
+      <w:r>
+        <w:rPr>
+          <w:lang w:val="en-PK"/>
+        </w:rPr>
+        <w:t xml:space="preserve">()  || </w:t>
+      </w:r>
+      <w:proofErr w:type="spellStart"/>
+      <w:r>
+        <w:rPr>
+          <w:lang w:val="en-PK"/>
+        </w:rPr>
+        <w:t>data.peek</w:t>
+      </w:r>
+      <w:proofErr w:type="spellEnd"/>
+      <w:r>
+        <w:rPr>
+          <w:lang w:val="en-PK"/>
+        </w:rPr>
+        <w:t>() &lt; 0 ){</w:t>
+      </w:r>
+    </w:p>
+    <w:p>
+      <w:pPr>
+        <w:rPr>
+          <w:lang w:val="en-PK"/>
+        </w:rPr>
+      </w:pPr>
+      <w:r>
+        <w:rPr>
+          <w:lang w:val="en-PK"/>
+        </w:rPr>
+        <w:t>                         </w:t>
+      </w:r>
+      <w:proofErr w:type="spellStart"/>
+      <w:proofErr w:type="gramStart"/>
+      <w:r>
+        <w:rPr>
+          <w:lang w:val="en-PK"/>
+        </w:rPr>
+        <w:t>data.push</w:t>
+      </w:r>
+      <w:proofErr w:type="spellEnd"/>
+      <w:proofErr w:type="gramEnd"/>
+      <w:r>
+        <w:rPr>
+          <w:lang w:val="en-PK"/>
+        </w:rPr>
+        <w:t>(asteroids[</w:t>
+      </w:r>
+      <w:proofErr w:type="spellStart"/>
+      <w:r>
+        <w:rPr>
+          <w:lang w:val="en-PK"/>
+        </w:rPr>
+        <w:t>i</w:t>
+      </w:r>
+      <w:proofErr w:type="spellEnd"/>
+      <w:r>
+        <w:rPr>
+          <w:lang w:val="en-PK"/>
+        </w:rPr>
+        <w:t>]); // negative along with negative numbers</w:t>
+      </w:r>
+    </w:p>
+    <w:p>
+      <w:pPr>
+        <w:rPr>
+          <w:lang w:val="en-PK"/>
+        </w:rPr>
+      </w:pPr>
+      <w:r>
+        <w:rPr>
+          <w:lang w:val="en-PK"/>
+        </w:rPr>
+        <w:t xml:space="preserve">                </w:t>
+      </w:r>
+    </w:p>
+    <w:p>
+      <w:pPr>
+        <w:rPr>
+          <w:lang w:val="en-PK"/>
+        </w:rPr>
+      </w:pPr>
+      <w:r>
+        <w:rPr>
+          <w:lang w:val="en-PK"/>
+        </w:rPr>
+        <w:t>                    }</w:t>
+      </w:r>
+    </w:p>
+    <w:p>
+      <w:pPr>
+        <w:rPr>
+          <w:lang w:val="en-PK"/>
+        </w:rPr>
+      </w:pPr>
+    </w:p>
+    <w:p>
+      <w:pPr>
+        <w:rPr>
+          <w:lang w:val="en-PK"/>
+        </w:rPr>
+      </w:pPr>
+      <w:r>
+        <w:rPr>
+          <w:lang w:val="en-PK"/>
+        </w:rPr>
+        <w:t>                      // equal numbers</w:t>
+      </w:r>
+    </w:p>
+    <w:p>
+      <w:pPr>
+        <w:rPr>
+          <w:lang w:val="en-PK"/>
+        </w:rPr>
+      </w:pPr>
+      <w:r>
+        <w:rPr>
+          <w:lang w:val="en-PK"/>
+        </w:rPr>
+        <w:t xml:space="preserve">                    </w:t>
+      </w:r>
+      <w:proofErr w:type="gramStart"/>
+      <w:r>
+        <w:rPr>
+          <w:lang w:val="en-PK"/>
+        </w:rPr>
+        <w:t>if( !</w:t>
+      </w:r>
+      <w:proofErr w:type="spellStart"/>
+      <w:proofErr w:type="gramEnd"/>
+      <w:r>
+        <w:rPr>
+          <w:lang w:val="en-PK"/>
+        </w:rPr>
+        <w:t>data.isEmpty</w:t>
+      </w:r>
+      <w:proofErr w:type="spellEnd"/>
+      <w:r>
+        <w:rPr>
+          <w:lang w:val="en-PK"/>
+        </w:rPr>
+        <w:t>() &amp;&amp;  </w:t>
+      </w:r>
+      <w:proofErr w:type="spellStart"/>
+      <w:r>
+        <w:rPr>
+          <w:lang w:val="en-PK"/>
+        </w:rPr>
+        <w:t>data.peek</w:t>
+      </w:r>
+      <w:proofErr w:type="spellEnd"/>
+      <w:r>
+        <w:rPr>
+          <w:lang w:val="en-PK"/>
+        </w:rPr>
+        <w:t xml:space="preserve">() == </w:t>
+      </w:r>
+      <w:proofErr w:type="spellStart"/>
+      <w:r>
+        <w:rPr>
+          <w:lang w:val="en-PK"/>
+        </w:rPr>
+        <w:t>ast</w:t>
+      </w:r>
+      <w:proofErr w:type="spellEnd"/>
+      <w:r>
+        <w:rPr>
+          <w:lang w:val="en-PK"/>
+        </w:rPr>
+        <w:t xml:space="preserve"> ){</w:t>
+      </w:r>
+    </w:p>
+    <w:p>
+      <w:pPr>
+        <w:rPr>
+          <w:lang w:val="en-PK"/>
+        </w:rPr>
+      </w:pPr>
+      <w:r>
+        <w:rPr>
+          <w:lang w:val="en-PK"/>
+        </w:rPr>
+        <w:t xml:space="preserve">                        </w:t>
+      </w:r>
+      <w:proofErr w:type="spellStart"/>
+      <w:proofErr w:type="gramStart"/>
+      <w:r>
+        <w:rPr>
+          <w:lang w:val="en-PK"/>
+        </w:rPr>
+        <w:t>data.pop</w:t>
+      </w:r>
+      <w:proofErr w:type="spellEnd"/>
+      <w:r>
+        <w:rPr>
+          <w:lang w:val="en-PK"/>
+        </w:rPr>
+        <w:t>(</w:t>
+      </w:r>
+      <w:proofErr w:type="gramEnd"/>
+      <w:r>
+        <w:rPr>
+          <w:lang w:val="en-PK"/>
+        </w:rPr>
+        <w:t>);</w:t>
+      </w:r>
+    </w:p>
+    <w:p>
+      <w:pPr>
+        <w:rPr>
+          <w:lang w:val="en-PK"/>
+        </w:rPr>
+      </w:pPr>
+      <w:r>
+        <w:rPr>
+          <w:lang w:val="en-PK"/>
+        </w:rPr>
+        <w:t>                        continue;</w:t>
+      </w:r>
+    </w:p>
+    <w:p>
+      <w:pPr>
+        <w:rPr>
+          <w:lang w:val="en-PK"/>
+        </w:rPr>
+      </w:pPr>
+      <w:r>
+        <w:rPr>
+          <w:lang w:val="en-PK"/>
+        </w:rPr>
+        <w:t>                    }</w:t>
+      </w:r>
+    </w:p>
+    <w:p>
+      <w:pPr>
+        <w:rPr>
+          <w:lang w:val="en-PK"/>
+        </w:rPr>
+      </w:pPr>
+      <w:r>
+        <w:rPr>
+          <w:lang w:val="en-PK"/>
+        </w:rPr>
+        <w:br/>
+      </w:r>
+      <w:r>
+        <w:rPr>
+          <w:lang w:val="en-PK"/>
+        </w:rPr>
+        <w:br/>
+      </w:r>
+    </w:p>
+    <w:p>
+      <w:pPr>
+        <w:rPr>
+          <w:lang w:val="en-PK"/>
+        </w:rPr>
+      </w:pPr>
+      <w:r>
+        <w:rPr>
+          <w:lang w:val="en-PK"/>
+        </w:rPr>
+        <w:t>                   </w:t>
+      </w:r>
+    </w:p>
+    <w:p>
+      <w:pPr>
+        <w:rPr>
+          <w:lang w:val="en-PK"/>
+        </w:rPr>
+      </w:pPr>
+    </w:p>
+    <w:p>
+      <w:pPr>
+        <w:rPr>
+          <w:lang w:val="en-PK"/>
+        </w:rPr>
+      </w:pPr>
+      <w:r>
+        <w:rPr>
+          <w:lang w:val="en-PK"/>
+        </w:rPr>
+        <w:t>                }</w:t>
+      </w:r>
+    </w:p>
+    <w:p>
+      <w:pPr>
+        <w:rPr>
+          <w:lang w:val="en-PK"/>
+        </w:rPr>
+      </w:pPr>
+    </w:p>
+    <w:p>
+      <w:pPr>
+        <w:rPr>
+          <w:lang w:val="en-PK"/>
+        </w:rPr>
+      </w:pPr>
+      <w:r>
+        <w:rPr>
+          <w:lang w:val="en-PK"/>
+        </w:rPr>
+        <w:t>                 else {</w:t>
+      </w:r>
+    </w:p>
+    <w:p>
+      <w:pPr>
+        <w:rPr>
+          <w:lang w:val="en-PK"/>
+        </w:rPr>
+      </w:pPr>
+      <w:r>
+        <w:rPr>
+          <w:lang w:val="en-PK"/>
+        </w:rPr>
+        <w:t xml:space="preserve">                </w:t>
+      </w:r>
+      <w:proofErr w:type="spellStart"/>
+      <w:proofErr w:type="gramStart"/>
+      <w:r>
+        <w:rPr>
+          <w:lang w:val="en-PK"/>
+        </w:rPr>
+        <w:t>data.push</w:t>
+      </w:r>
+      <w:proofErr w:type="spellEnd"/>
+      <w:proofErr w:type="gramEnd"/>
+      <w:r>
+        <w:rPr>
+          <w:lang w:val="en-PK"/>
+        </w:rPr>
+        <w:t>(asteroids[</w:t>
+      </w:r>
+      <w:proofErr w:type="spellStart"/>
+      <w:r>
+        <w:rPr>
+          <w:lang w:val="en-PK"/>
+        </w:rPr>
+        <w:t>i</w:t>
+      </w:r>
+      <w:proofErr w:type="spellEnd"/>
+      <w:r>
+        <w:rPr>
+          <w:lang w:val="en-PK"/>
+        </w:rPr>
+        <w:t>]);</w:t>
+      </w:r>
+    </w:p>
+    <w:p>
+      <w:pPr>
+        <w:rPr>
+          <w:lang w:val="en-PK"/>
+        </w:rPr>
+      </w:pPr>
+      <w:r>
+        <w:rPr>
+          <w:lang w:val="en-PK"/>
+        </w:rPr>
+        <w:t>            }</w:t>
+      </w:r>
+    </w:p>
+    <w:p>
+      <w:pPr>
+        <w:rPr>
+          <w:lang w:val="en-PK"/>
+        </w:rPr>
+      </w:pPr>
+    </w:p>
+    <w:p>
+      <w:pPr>
+        <w:rPr>
+          <w:lang w:val="en-PK"/>
+        </w:rPr>
+      </w:pPr>
+      <w:r>
+        <w:rPr>
+          <w:lang w:val="en-PK"/>
+        </w:rPr>
+        <w:t xml:space="preserve">            } </w:t>
+      </w:r>
+    </w:p>
+    <w:p>
+      <w:pPr>
+        <w:rPr>
+          <w:lang w:val="en-PK"/>
+        </w:rPr>
+      </w:pPr>
+    </w:p>
+    <w:p>
+      <w:pPr>
+        <w:rPr>
+          <w:lang w:val="en-PK"/>
+        </w:rPr>
+      </w:pPr>
+      <w:r>
+        <w:rPr>
+          <w:lang w:val="en-PK"/>
+        </w:rPr>
+        <w:t xml:space="preserve">              </w:t>
+      </w:r>
+      <w:proofErr w:type="spellStart"/>
+      <w:r>
+        <w:rPr>
+          <w:lang w:val="en-PK"/>
+        </w:rPr>
+        <w:t>System.out.println</w:t>
+      </w:r>
+      <w:proofErr w:type="spellEnd"/>
+      <w:r>
+        <w:rPr>
+          <w:lang w:val="en-PK"/>
+        </w:rPr>
+        <w:t>(data);</w:t>
+      </w:r>
+    </w:p>
+    <w:p>
+      <w:pPr>
+        <w:rPr>
+          <w:lang w:val="en-PK"/>
+        </w:rPr>
+      </w:pPr>
+    </w:p>
+    <w:p>
+      <w:pPr>
+        <w:rPr>
+          <w:lang w:val="en-PK"/>
+        </w:rPr>
+      </w:pPr>
+      <w:r>
+        <w:rPr>
+          <w:lang w:val="en-PK"/>
+        </w:rPr>
+        <w:lastRenderedPageBreak/>
+        <w:t xml:space="preserve">        </w:t>
+      </w:r>
+      <w:proofErr w:type="gramStart"/>
+      <w:r>
+        <w:rPr>
+          <w:lang w:val="en-PK"/>
+        </w:rPr>
+        <w:t>int[</w:t>
+      </w:r>
+      <w:proofErr w:type="gramEnd"/>
+      <w:r>
+        <w:rPr>
+          <w:lang w:val="en-PK"/>
+        </w:rPr>
+        <w:t xml:space="preserve">] </w:t>
+      </w:r>
+      <w:proofErr w:type="spellStart"/>
+      <w:r>
+        <w:rPr>
+          <w:lang w:val="en-PK"/>
+        </w:rPr>
+        <w:t>arr</w:t>
+      </w:r>
+      <w:proofErr w:type="spellEnd"/>
+      <w:r>
+        <w:rPr>
+          <w:lang w:val="en-PK"/>
+        </w:rPr>
+        <w:t xml:space="preserve"> = new int[</w:t>
+      </w:r>
+      <w:proofErr w:type="spellStart"/>
+      <w:r>
+        <w:rPr>
+          <w:lang w:val="en-PK"/>
+        </w:rPr>
+        <w:t>data.size</w:t>
+      </w:r>
+      <w:proofErr w:type="spellEnd"/>
+      <w:r>
+        <w:rPr>
+          <w:lang w:val="en-PK"/>
+        </w:rPr>
+        <w:t>()];</w:t>
+      </w:r>
+    </w:p>
+    <w:p>
+      <w:pPr>
+        <w:rPr>
+          <w:lang w:val="en-PK"/>
+        </w:rPr>
+      </w:pPr>
+      <w:r>
+        <w:rPr>
+          <w:lang w:val="en-PK"/>
+        </w:rPr>
+        <w:t xml:space="preserve">        for (int </w:t>
+      </w:r>
+      <w:proofErr w:type="spellStart"/>
+      <w:r>
+        <w:rPr>
+          <w:lang w:val="en-PK"/>
+        </w:rPr>
+        <w:t>i</w:t>
+      </w:r>
+      <w:proofErr w:type="spellEnd"/>
+      <w:r>
+        <w:rPr>
+          <w:lang w:val="en-PK"/>
+        </w:rPr>
+        <w:t xml:space="preserve"> = 0; </w:t>
+      </w:r>
+      <w:proofErr w:type="spellStart"/>
+      <w:r>
+        <w:rPr>
+          <w:lang w:val="en-PK"/>
+        </w:rPr>
+        <w:t>i</w:t>
+      </w:r>
+      <w:proofErr w:type="spellEnd"/>
+      <w:r>
+        <w:rPr>
+          <w:lang w:val="en-PK"/>
+        </w:rPr>
+        <w:t xml:space="preserve"> &lt; </w:t>
+      </w:r>
+      <w:proofErr w:type="spellStart"/>
+      <w:proofErr w:type="gramStart"/>
+      <w:r>
+        <w:rPr>
+          <w:lang w:val="en-PK"/>
+        </w:rPr>
+        <w:t>arr.length</w:t>
+      </w:r>
+      <w:proofErr w:type="spellEnd"/>
+      <w:proofErr w:type="gramEnd"/>
+      <w:r>
+        <w:rPr>
+          <w:lang w:val="en-PK"/>
+        </w:rPr>
+        <w:t xml:space="preserve">; </w:t>
+      </w:r>
+      <w:proofErr w:type="spellStart"/>
+      <w:r>
+        <w:rPr>
+          <w:lang w:val="en-PK"/>
+        </w:rPr>
+        <w:t>i</w:t>
+      </w:r>
+      <w:proofErr w:type="spellEnd"/>
+      <w:r>
+        <w:rPr>
+          <w:lang w:val="en-PK"/>
+        </w:rPr>
+        <w:t>++) {</w:t>
+      </w:r>
+    </w:p>
+    <w:p>
+      <w:pPr>
+        <w:rPr>
+          <w:lang w:val="en-PK"/>
+        </w:rPr>
+      </w:pPr>
+      <w:r>
+        <w:rPr>
+          <w:lang w:val="en-PK"/>
+        </w:rPr>
+        <w:t>             </w:t>
+      </w:r>
+      <w:proofErr w:type="spellStart"/>
+      <w:r>
+        <w:rPr>
+          <w:lang w:val="en-PK"/>
+        </w:rPr>
+        <w:t>arr</w:t>
+      </w:r>
+      <w:proofErr w:type="spellEnd"/>
+      <w:r>
+        <w:rPr>
+          <w:lang w:val="en-PK"/>
+        </w:rPr>
+        <w:t>[</w:t>
+      </w:r>
+      <w:proofErr w:type="spellStart"/>
+      <w:r>
+        <w:rPr>
+          <w:lang w:val="en-PK"/>
+        </w:rPr>
+        <w:t>i</w:t>
+      </w:r>
+      <w:proofErr w:type="spellEnd"/>
+      <w:r>
+        <w:rPr>
+          <w:lang w:val="en-PK"/>
+        </w:rPr>
+        <w:t xml:space="preserve">] = </w:t>
+      </w:r>
+      <w:proofErr w:type="spellStart"/>
+      <w:r>
+        <w:rPr>
+          <w:lang w:val="en-PK"/>
+        </w:rPr>
+        <w:t>data.get</w:t>
+      </w:r>
+      <w:proofErr w:type="spellEnd"/>
+      <w:r>
+        <w:rPr>
+          <w:lang w:val="en-PK"/>
+        </w:rPr>
+        <w:t>(</w:t>
+      </w:r>
+      <w:proofErr w:type="spellStart"/>
+      <w:r>
+        <w:rPr>
+          <w:lang w:val="en-PK"/>
+        </w:rPr>
+        <w:t>i</w:t>
+      </w:r>
+      <w:proofErr w:type="spellEnd"/>
+      <w:r>
+        <w:rPr>
+          <w:lang w:val="en-PK"/>
+        </w:rPr>
+        <w:t>); // Direct access without popping</w:t>
+      </w:r>
+    </w:p>
+    <w:p>
+      <w:pPr>
+        <w:rPr>
+          <w:lang w:val="en-PK"/>
+        </w:rPr>
+      </w:pPr>
+      <w:r>
+        <w:rPr>
+          <w:lang w:val="en-PK"/>
+        </w:rPr>
+        <w:t>        }</w:t>
+      </w:r>
+    </w:p>
+    <w:p>
+      <w:pPr>
+        <w:rPr>
+          <w:lang w:val="en-PK"/>
+        </w:rPr>
+      </w:pPr>
+    </w:p>
+    <w:p>
+      <w:pPr>
+        <w:rPr>
+          <w:lang w:val="en-PK"/>
+        </w:rPr>
+      </w:pPr>
+      <w:r>
+        <w:rPr>
+          <w:lang w:val="en-PK"/>
+        </w:rPr>
+        <w:t xml:space="preserve">        return </w:t>
+      </w:r>
+      <w:proofErr w:type="spellStart"/>
+      <w:r>
+        <w:rPr>
+          <w:lang w:val="en-PK"/>
+        </w:rPr>
+        <w:t>arr</w:t>
+      </w:r>
+      <w:proofErr w:type="spellEnd"/>
+      <w:r>
+        <w:rPr>
+          <w:lang w:val="en-PK"/>
+        </w:rPr>
+        <w:t>;</w:t>
+      </w:r>
+    </w:p>
+    <w:p>
+      <w:pPr>
+        <w:rPr>
+          <w:lang w:val="en-PK"/>
+        </w:rPr>
+      </w:pPr>
+      <w:r>
+        <w:rPr>
+          <w:lang w:val="en-PK"/>
+        </w:rPr>
+        <w:t>           </w:t>
+      </w:r>
+    </w:p>
+    <w:p>
+      <w:pPr>
+        <w:rPr>
+          <w:lang w:val="en-PK"/>
+        </w:rPr>
+      </w:pPr>
+      <w:r>
+        <w:rPr>
+          <w:lang w:val="en-PK"/>
+        </w:rPr>
+        <w:t xml:space="preserve">        </w:t>
+      </w:r>
+    </w:p>
+    <w:p>
+      <w:pPr>
+        <w:rPr>
+          <w:lang w:val="en-PK"/>
+        </w:rPr>
+      </w:pPr>
+      <w:r>
+        <w:rPr>
+          <w:lang w:val="en-PK"/>
+        </w:rPr>
+        <w:t>        }</w:t>
+      </w:r>
+    </w:p>
+    <w:p>
+      <w:pPr>
+        <w:rPr>
+          <w:lang w:val="en-PK"/>
+        </w:rPr>
+      </w:pPr>
+    </w:p>
+    <w:p>
+      <w:pPr>
+        <w:rPr>
+          <w:lang w:val="en-PK"/>
+        </w:rPr>
+      </w:pPr>
+      <w:r>
+        <w:rPr>
+          <w:lang w:val="en-PK"/>
+        </w:rPr>
+        <w:t xml:space="preserve">      </w:t>
+      </w:r>
+    </w:p>
+    <w:p>
+      <w:pPr>
+        <w:rPr>
+          <w:lang w:val="en-PK"/>
+        </w:rPr>
+      </w:pPr>
+    </w:p>
+    <w:p>
+      <w:pPr>
+        <w:rPr>
+          <w:lang w:val="en-PK"/>
+        </w:rPr>
+      </w:pPr>
+      <w:r>
+        <w:rPr>
+          <w:lang w:val="en-PK"/>
+        </w:rPr>
+        <w:t>}</w:t>
+      </w:r>
+    </w:p>
+    <w:p>
+      <w:pPr>
+        <w:rPr>
+          <w:lang w:val="en-PK"/>
+        </w:rPr>
+      </w:pPr>
+    </w:p>
+    <w:p>
+      <w:pPr>
+        <w:rPr>
+          <w:lang w:val="en-PK"/>
+        </w:rPr>
+      </w:pPr>
+    </w:p>
+    <w:p>
+      <w:pPr>
+        <w:rPr>
+          <w:lang w:val="en-PK"/>
+        </w:rPr>
+      </w:pPr>
     </w:p>
     <w:p>
       <w:pPr>
@@ -7314,9 +9304,9 @@
     </w:lvl>
   </w:abstractNum>
   <w:abstractNum w:abstractNumId="1" w15:restartNumberingAfterBreak="0">
-    <w:nsid w:val="23884149"/>
+    <w:nsid w:val="08CB74E8"/>
     <w:multiLevelType w:val="hybridMultilevel"/>
-    <w:tmpl w:val="7F8A4DDC"/>
+    <w:tmpl w:val="640CB104"/>
     <w:lvl w:ilvl="0" w:tplc="20000001">
       <w:start w:val="1"/>
       <w:numFmt w:val="bullet"/>
@@ -7427,95 +9417,9 @@
     </w:lvl>
   </w:abstractNum>
   <w:abstractNum w:abstractNumId="2" w15:restartNumberingAfterBreak="0">
-    <w:nsid w:val="445A65A7"/>
+    <w:nsid w:val="23884149"/>
     <w:multiLevelType w:val="hybridMultilevel"/>
-    <w:tmpl w:val="29F29E36"/>
-    <w:lvl w:ilvl="0" w:tplc="9DEE4DDC">
-      <w:start w:val="1"/>
-      <w:numFmt w:val="decimal"/>
-      <w:lvlText w:val="%1."/>
-      <w:lvlJc w:val="left"/>
-      <w:pPr>
-        <w:ind w:left="720" w:hanging="360"/>
-      </w:pPr>
-    </w:lvl>
-    <w:lvl w:ilvl="1" w:tplc="20000019" w:tentative="1">
-      <w:start w:val="1"/>
-      <w:numFmt w:val="lowerLetter"/>
-      <w:lvlText w:val="%2."/>
-      <w:lvlJc w:val="left"/>
-      <w:pPr>
-        <w:ind w:left="1440" w:hanging="360"/>
-      </w:pPr>
-    </w:lvl>
-    <w:lvl w:ilvl="2" w:tplc="2000001B" w:tentative="1">
-      <w:start w:val="1"/>
-      <w:numFmt w:val="lowerRoman"/>
-      <w:lvlText w:val="%3."/>
-      <w:lvlJc w:val="right"/>
-      <w:pPr>
-        <w:ind w:left="2160" w:hanging="180"/>
-      </w:pPr>
-    </w:lvl>
-    <w:lvl w:ilvl="3" w:tplc="2000000F" w:tentative="1">
-      <w:start w:val="1"/>
-      <w:numFmt w:val="decimal"/>
-      <w:lvlText w:val="%4."/>
-      <w:lvlJc w:val="left"/>
-      <w:pPr>
-        <w:ind w:left="2880" w:hanging="360"/>
-      </w:pPr>
-    </w:lvl>
-    <w:lvl w:ilvl="4" w:tplc="20000019" w:tentative="1">
-      <w:start w:val="1"/>
-      <w:numFmt w:val="lowerLetter"/>
-      <w:lvlText w:val="%5."/>
-      <w:lvlJc w:val="left"/>
-      <w:pPr>
-        <w:ind w:left="3600" w:hanging="360"/>
-      </w:pPr>
-    </w:lvl>
-    <w:lvl w:ilvl="5" w:tplc="2000001B" w:tentative="1">
-      <w:start w:val="1"/>
-      <w:numFmt w:val="lowerRoman"/>
-      <w:lvlText w:val="%6."/>
-      <w:lvlJc w:val="right"/>
-      <w:pPr>
-        <w:ind w:left="4320" w:hanging="180"/>
-      </w:pPr>
-    </w:lvl>
-    <w:lvl w:ilvl="6" w:tplc="2000000F" w:tentative="1">
-      <w:start w:val="1"/>
-      <w:numFmt w:val="decimal"/>
-      <w:lvlText w:val="%7."/>
-      <w:lvlJc w:val="left"/>
-      <w:pPr>
-        <w:ind w:left="5040" w:hanging="360"/>
-      </w:pPr>
-    </w:lvl>
-    <w:lvl w:ilvl="7" w:tplc="20000019" w:tentative="1">
-      <w:start w:val="1"/>
-      <w:numFmt w:val="lowerLetter"/>
-      <w:lvlText w:val="%8."/>
-      <w:lvlJc w:val="left"/>
-      <w:pPr>
-        <w:ind w:left="5760" w:hanging="360"/>
-      </w:pPr>
-    </w:lvl>
-    <w:lvl w:ilvl="8" w:tplc="2000001B" w:tentative="1">
-      <w:start w:val="1"/>
-      <w:numFmt w:val="lowerRoman"/>
-      <w:lvlText w:val="%9."/>
-      <w:lvlJc w:val="right"/>
-      <w:pPr>
-        <w:ind w:left="6480" w:hanging="180"/>
-      </w:pPr>
-    </w:lvl>
-  </w:abstractNum>
-  <w:abstractNum w:abstractNumId="3" w15:restartNumberingAfterBreak="0">
-    <w:nsid w:val="4F441A35"/>
-    <w:multiLevelType w:val="hybridMultilevel"/>
-    <w:tmpl w:val="2662ED76"/>
+    <w:tmpl w:val="7F8A4DDC"/>
     <w:lvl w:ilvl="0" w:tplc="20000001">
       <w:start w:val="1"/>
       <w:numFmt w:val="bullet"/>
@@ -7625,7 +9529,206 @@
       </w:rPr>
     </w:lvl>
   </w:abstractNum>
+  <w:abstractNum w:abstractNumId="3" w15:restartNumberingAfterBreak="0">
+    <w:nsid w:val="445A65A7"/>
+    <w:multiLevelType w:val="hybridMultilevel"/>
+    <w:tmpl w:val="29F29E36"/>
+    <w:lvl w:ilvl="0" w:tplc="9DEE4DDC">
+      <w:start w:val="1"/>
+      <w:numFmt w:val="decimal"/>
+      <w:lvlText w:val="%1."/>
+      <w:lvlJc w:val="left"/>
+      <w:pPr>
+        <w:ind w:left="720" w:hanging="360"/>
+      </w:pPr>
+    </w:lvl>
+    <w:lvl w:ilvl="1" w:tplc="20000019" w:tentative="1">
+      <w:start w:val="1"/>
+      <w:numFmt w:val="lowerLetter"/>
+      <w:lvlText w:val="%2."/>
+      <w:lvlJc w:val="left"/>
+      <w:pPr>
+        <w:ind w:left="1440" w:hanging="360"/>
+      </w:pPr>
+    </w:lvl>
+    <w:lvl w:ilvl="2" w:tplc="2000001B" w:tentative="1">
+      <w:start w:val="1"/>
+      <w:numFmt w:val="lowerRoman"/>
+      <w:lvlText w:val="%3."/>
+      <w:lvlJc w:val="right"/>
+      <w:pPr>
+        <w:ind w:left="2160" w:hanging="180"/>
+      </w:pPr>
+    </w:lvl>
+    <w:lvl w:ilvl="3" w:tplc="2000000F" w:tentative="1">
+      <w:start w:val="1"/>
+      <w:numFmt w:val="decimal"/>
+      <w:lvlText w:val="%4."/>
+      <w:lvlJc w:val="left"/>
+      <w:pPr>
+        <w:ind w:left="2880" w:hanging="360"/>
+      </w:pPr>
+    </w:lvl>
+    <w:lvl w:ilvl="4" w:tplc="20000019" w:tentative="1">
+      <w:start w:val="1"/>
+      <w:numFmt w:val="lowerLetter"/>
+      <w:lvlText w:val="%5."/>
+      <w:lvlJc w:val="left"/>
+      <w:pPr>
+        <w:ind w:left="3600" w:hanging="360"/>
+      </w:pPr>
+    </w:lvl>
+    <w:lvl w:ilvl="5" w:tplc="2000001B" w:tentative="1">
+      <w:start w:val="1"/>
+      <w:numFmt w:val="lowerRoman"/>
+      <w:lvlText w:val="%6."/>
+      <w:lvlJc w:val="right"/>
+      <w:pPr>
+        <w:ind w:left="4320" w:hanging="180"/>
+      </w:pPr>
+    </w:lvl>
+    <w:lvl w:ilvl="6" w:tplc="2000000F" w:tentative="1">
+      <w:start w:val="1"/>
+      <w:numFmt w:val="decimal"/>
+      <w:lvlText w:val="%7."/>
+      <w:lvlJc w:val="left"/>
+      <w:pPr>
+        <w:ind w:left="5040" w:hanging="360"/>
+      </w:pPr>
+    </w:lvl>
+    <w:lvl w:ilvl="7" w:tplc="20000019" w:tentative="1">
+      <w:start w:val="1"/>
+      <w:numFmt w:val="lowerLetter"/>
+      <w:lvlText w:val="%8."/>
+      <w:lvlJc w:val="left"/>
+      <w:pPr>
+        <w:ind w:left="5760" w:hanging="360"/>
+      </w:pPr>
+    </w:lvl>
+    <w:lvl w:ilvl="8" w:tplc="2000001B" w:tentative="1">
+      <w:start w:val="1"/>
+      <w:numFmt w:val="lowerRoman"/>
+      <w:lvlText w:val="%9."/>
+      <w:lvlJc w:val="right"/>
+      <w:pPr>
+        <w:ind w:left="6480" w:hanging="180"/>
+      </w:pPr>
+    </w:lvl>
+  </w:abstractNum>
   <w:abstractNum w:abstractNumId="4" w15:restartNumberingAfterBreak="0">
+    <w:nsid w:val="4F441A35"/>
+    <w:multiLevelType w:val="hybridMultilevel"/>
+    <w:tmpl w:val="2662ED76"/>
+    <w:lvl w:ilvl="0" w:tplc="20000001">
+      <w:start w:val="1"/>
+      <w:numFmt w:val="bullet"/>
+      <w:lvlText w:val=""/>
+      <w:lvlJc w:val="left"/>
+      <w:pPr>
+        <w:ind w:left="720" w:hanging="360"/>
+      </w:pPr>
+      <w:rPr>
+        <w:rFonts w:ascii="Symbol" w:hAnsi="Symbol" w:hint="default"/>
+      </w:rPr>
+    </w:lvl>
+    <w:lvl w:ilvl="1" w:tplc="20000003" w:tentative="1">
+      <w:start w:val="1"/>
+      <w:numFmt w:val="bullet"/>
+      <w:lvlText w:val="o"/>
+      <w:lvlJc w:val="left"/>
+      <w:pPr>
+        <w:ind w:left="1440" w:hanging="360"/>
+      </w:pPr>
+      <w:rPr>
+        <w:rFonts w:ascii="Courier New" w:hAnsi="Courier New" w:cs="Courier New" w:hint="default"/>
+      </w:rPr>
+    </w:lvl>
+    <w:lvl w:ilvl="2" w:tplc="20000005" w:tentative="1">
+      <w:start w:val="1"/>
+      <w:numFmt w:val="bullet"/>
+      <w:lvlText w:val=""/>
+      <w:lvlJc w:val="left"/>
+      <w:pPr>
+        <w:ind w:left="2160" w:hanging="360"/>
+      </w:pPr>
+      <w:rPr>
+        <w:rFonts w:ascii="Wingdings" w:hAnsi="Wingdings" w:hint="default"/>
+      </w:rPr>
+    </w:lvl>
+    <w:lvl w:ilvl="3" w:tplc="20000001" w:tentative="1">
+      <w:start w:val="1"/>
+      <w:numFmt w:val="bullet"/>
+      <w:lvlText w:val=""/>
+      <w:lvlJc w:val="left"/>
+      <w:pPr>
+        <w:ind w:left="2880" w:hanging="360"/>
+      </w:pPr>
+      <w:rPr>
+        <w:rFonts w:ascii="Symbol" w:hAnsi="Symbol" w:hint="default"/>
+      </w:rPr>
+    </w:lvl>
+    <w:lvl w:ilvl="4" w:tplc="20000003" w:tentative="1">
+      <w:start w:val="1"/>
+      <w:numFmt w:val="bullet"/>
+      <w:lvlText w:val="o"/>
+      <w:lvlJc w:val="left"/>
+      <w:pPr>
+        <w:ind w:left="3600" w:hanging="360"/>
+      </w:pPr>
+      <w:rPr>
+        <w:rFonts w:ascii="Courier New" w:hAnsi="Courier New" w:cs="Courier New" w:hint="default"/>
+      </w:rPr>
+    </w:lvl>
+    <w:lvl w:ilvl="5" w:tplc="20000005" w:tentative="1">
+      <w:start w:val="1"/>
+      <w:numFmt w:val="bullet"/>
+      <w:lvlText w:val=""/>
+      <w:lvlJc w:val="left"/>
+      <w:pPr>
+        <w:ind w:left="4320" w:hanging="360"/>
+      </w:pPr>
+      <w:rPr>
+        <w:rFonts w:ascii="Wingdings" w:hAnsi="Wingdings" w:hint="default"/>
+      </w:rPr>
+    </w:lvl>
+    <w:lvl w:ilvl="6" w:tplc="20000001" w:tentative="1">
+      <w:start w:val="1"/>
+      <w:numFmt w:val="bullet"/>
+      <w:lvlText w:val=""/>
+      <w:lvlJc w:val="left"/>
+      <w:pPr>
+        <w:ind w:left="5040" w:hanging="360"/>
+      </w:pPr>
+      <w:rPr>
+        <w:rFonts w:ascii="Symbol" w:hAnsi="Symbol" w:hint="default"/>
+      </w:rPr>
+    </w:lvl>
+    <w:lvl w:ilvl="7" w:tplc="20000003" w:tentative="1">
+      <w:start w:val="1"/>
+      <w:numFmt w:val="bullet"/>
+      <w:lvlText w:val="o"/>
+      <w:lvlJc w:val="left"/>
+      <w:pPr>
+        <w:ind w:left="5760" w:hanging="360"/>
+      </w:pPr>
+      <w:rPr>
+        <w:rFonts w:ascii="Courier New" w:hAnsi="Courier New" w:cs="Courier New" w:hint="default"/>
+      </w:rPr>
+    </w:lvl>
+    <w:lvl w:ilvl="8" w:tplc="20000005" w:tentative="1">
+      <w:start w:val="1"/>
+      <w:numFmt w:val="bullet"/>
+      <w:lvlText w:val=""/>
+      <w:lvlJc w:val="left"/>
+      <w:pPr>
+        <w:ind w:left="6480" w:hanging="360"/>
+      </w:pPr>
+      <w:rPr>
+        <w:rFonts w:ascii="Wingdings" w:hAnsi="Wingdings" w:hint="default"/>
+      </w:rPr>
+    </w:lvl>
+  </w:abstractNum>
+  <w:abstractNum w:abstractNumId="5" w15:restartNumberingAfterBreak="0">
     <w:nsid w:val="77072ABA"/>
     <w:multiLevelType w:val="multilevel"/>
     <w:tmpl w:val="A100EBCE"/>
@@ -7740,21 +9843,24 @@
     </w:lvl>
   </w:abstractNum>
   <w:num w:numId="1" w16cid:durableId="1754811861">
-    <w:abstractNumId w:val="2"/>
+    <w:abstractNumId w:val="3"/>
   </w:num>
   <w:num w:numId="2" w16cid:durableId="290282579">
-    <w:abstractNumId w:val="2"/>
+    <w:abstractNumId w:val="3"/>
   </w:num>
   <w:num w:numId="3" w16cid:durableId="1935935932">
-    <w:abstractNumId w:val="4"/>
+    <w:abstractNumId w:val="5"/>
   </w:num>
   <w:num w:numId="4" w16cid:durableId="2136369365">
     <w:abstractNumId w:val="0"/>
   </w:num>
   <w:num w:numId="5" w16cid:durableId="279528597">
-    <w:abstractNumId w:val="3"/>
+    <w:abstractNumId w:val="4"/>
   </w:num>
   <w:num w:numId="6" w16cid:durableId="849216912">
+    <w:abstractNumId w:val="2"/>
+  </w:num>
+  <w:num w:numId="7" w16cid:durableId="62072684">
     <w:abstractNumId w:val="1"/>
   </w:num>
 </w:numbering>

</xml_diff>

<commit_message>
One more stack problem -> Daily Temperatures using monotonic stack
</commit_message>
<xml_diff>
--- a/Stack.docx
+++ b/Stack.docx
@@ -9114,6 +9114,1818 @@
         </w:rPr>
         <w:t>}</w:t>
       </w:r>
+    </w:p>
+    <w:p>
+      <w:pPr>
+        <w:rPr>
+          <w:lang w:val="en-PK"/>
+        </w:rPr>
+      </w:pPr>
+      <w:hyperlink r:id="rId12" w:history="1">
+        <w:r>
+          <w:rPr>
+            <w:rStyle w:val="Hyperlink"/>
+            <w:b/>
+            <w:bCs/>
+          </w:rPr>
+          <w:t>Next Greater Element I</w:t>
+        </w:r>
+      </w:hyperlink>
+    </w:p>
+    <w:p>
+      <w:pPr>
+        <w:rPr>
+          <w:lang w:val="en-PK"/>
+        </w:rPr>
+      </w:pPr>
+      <w:r>
+        <w:rPr>
+          <w:lang w:val="en-PK"/>
+        </w:rPr>
+        <w:t>Push stack in decreasing sub sequence and fetch the popped elements if current element greater than peek and use popped as a key and current element as greater value for them</w:t>
+      </w:r>
+    </w:p>
+    <w:p>
+      <w:pPr>
+        <w:rPr>
+          <w:lang w:val="en-PK"/>
+        </w:rPr>
+      </w:pPr>
+      <w:r>
+        <w:rPr>
+          <w:lang w:val="en-PK"/>
+        </w:rPr>
+        <w:t>class Solution {</w:t>
+      </w:r>
+    </w:p>
+    <w:p>
+      <w:pPr>
+        <w:rPr>
+          <w:lang w:val="en-PK"/>
+        </w:rPr>
+      </w:pPr>
+      <w:r>
+        <w:rPr>
+          <w:lang w:val="en-PK"/>
+        </w:rPr>
+        <w:t xml:space="preserve">    public </w:t>
+      </w:r>
+      <w:proofErr w:type="gramStart"/>
+      <w:r>
+        <w:rPr>
+          <w:lang w:val="en-PK"/>
+        </w:rPr>
+        <w:t>int[</w:t>
+      </w:r>
+      <w:proofErr w:type="gramEnd"/>
+      <w:r>
+        <w:rPr>
+          <w:lang w:val="en-PK"/>
+        </w:rPr>
+        <w:t xml:space="preserve">] </w:t>
+      </w:r>
+      <w:proofErr w:type="spellStart"/>
+      <w:r>
+        <w:rPr>
+          <w:lang w:val="en-PK"/>
+        </w:rPr>
+        <w:t>nextGreaterElement</w:t>
+      </w:r>
+      <w:proofErr w:type="spellEnd"/>
+      <w:r>
+        <w:rPr>
+          <w:lang w:val="en-PK"/>
+        </w:rPr>
+        <w:t>(int[] nums1, int[] nums2) {</w:t>
+      </w:r>
+    </w:p>
+    <w:p>
+      <w:pPr>
+        <w:rPr>
+          <w:lang w:val="en-PK"/>
+        </w:rPr>
+      </w:pPr>
+      <w:r>
+        <w:rPr>
+          <w:lang w:val="en-PK"/>
+        </w:rPr>
+        <w:t>        // 1 ,</w:t>
+      </w:r>
+      <w:proofErr w:type="gramStart"/>
+      <w:r>
+        <w:rPr>
+          <w:lang w:val="en-PK"/>
+        </w:rPr>
+        <w:t>3 ,</w:t>
+      </w:r>
+      <w:proofErr w:type="gramEnd"/>
+      <w:r>
+        <w:rPr>
+          <w:lang w:val="en-PK"/>
+        </w:rPr>
+        <w:t xml:space="preserve"> 4 , 2</w:t>
+      </w:r>
+    </w:p>
+    <w:p>
+      <w:pPr>
+        <w:rPr>
+          <w:lang w:val="en-PK"/>
+        </w:rPr>
+      </w:pPr>
+    </w:p>
+    <w:p>
+      <w:pPr>
+        <w:rPr>
+          <w:lang w:val="en-PK"/>
+        </w:rPr>
+      </w:pPr>
+      <w:r>
+        <w:rPr>
+          <w:lang w:val="en-PK"/>
+        </w:rPr>
+        <w:t>        Stack&lt;Integer&gt; stack = new Stack&lt;Integer</w:t>
+      </w:r>
+      <w:proofErr w:type="gramStart"/>
+      <w:r>
+        <w:rPr>
+          <w:lang w:val="en-PK"/>
+        </w:rPr>
+        <w:t>&gt;(</w:t>
+      </w:r>
+      <w:proofErr w:type="gramEnd"/>
+      <w:r>
+        <w:rPr>
+          <w:lang w:val="en-PK"/>
+        </w:rPr>
+        <w:t>);</w:t>
+      </w:r>
+    </w:p>
+    <w:p>
+      <w:pPr>
+        <w:rPr>
+          <w:lang w:val="en-PK"/>
+        </w:rPr>
+      </w:pPr>
+      <w:r>
+        <w:rPr>
+          <w:lang w:val="en-PK"/>
+        </w:rPr>
+        <w:t>        HashMap&lt;</w:t>
+      </w:r>
+      <w:proofErr w:type="spellStart"/>
+      <w:proofErr w:type="gramStart"/>
+      <w:r>
+        <w:rPr>
+          <w:lang w:val="en-PK"/>
+        </w:rPr>
+        <w:t>Integer,Integer</w:t>
+      </w:r>
+      <w:proofErr w:type="spellEnd"/>
+      <w:proofErr w:type="gramEnd"/>
+      <w:r>
+        <w:rPr>
+          <w:lang w:val="en-PK"/>
+        </w:rPr>
+        <w:t>&gt; map = new HashMap&lt;</w:t>
+      </w:r>
+      <w:proofErr w:type="spellStart"/>
+      <w:r>
+        <w:rPr>
+          <w:lang w:val="en-PK"/>
+        </w:rPr>
+        <w:t>Integer,Integer</w:t>
+      </w:r>
+      <w:proofErr w:type="spellEnd"/>
+      <w:r>
+        <w:rPr>
+          <w:lang w:val="en-PK"/>
+        </w:rPr>
+        <w:t>&gt;();</w:t>
+      </w:r>
+    </w:p>
+    <w:p>
+      <w:pPr>
+        <w:rPr>
+          <w:lang w:val="en-PK"/>
+        </w:rPr>
+      </w:pPr>
+      <w:r>
+        <w:rPr>
+          <w:lang w:val="en-PK"/>
+        </w:rPr>
+        <w:t>        // add decreasing sub sequence</w:t>
+      </w:r>
+    </w:p>
+    <w:p>
+      <w:pPr>
+        <w:rPr>
+          <w:lang w:val="en-PK"/>
+        </w:rPr>
+      </w:pPr>
+      <w:r>
+        <w:rPr>
+          <w:lang w:val="en-PK"/>
+        </w:rPr>
+        <w:t xml:space="preserve">        // like 8 5 4 3 2 1 6, now 6 </w:t>
+      </w:r>
+      <w:proofErr w:type="spellStart"/>
+      <w:r>
+        <w:rPr>
+          <w:lang w:val="en-PK"/>
+        </w:rPr>
+        <w:t>occured</w:t>
+      </w:r>
+      <w:proofErr w:type="spellEnd"/>
+      <w:r>
+        <w:rPr>
+          <w:lang w:val="en-PK"/>
+        </w:rPr>
+        <w:t xml:space="preserve"> so get 1,2,3,4,5 as keys and their values as 6</w:t>
+      </w:r>
+    </w:p>
+    <w:p>
+      <w:pPr>
+        <w:rPr>
+          <w:lang w:val="en-PK"/>
+        </w:rPr>
+      </w:pPr>
+      <w:r>
+        <w:rPr>
+          <w:lang w:val="en-PK"/>
+        </w:rPr>
+        <w:t xml:space="preserve">        // 1 3 4 </w:t>
+      </w:r>
+      <w:proofErr w:type="gramStart"/>
+      <w:r>
+        <w:rPr>
+          <w:lang w:val="en-PK"/>
+        </w:rPr>
+        <w:t>2 ,</w:t>
+      </w:r>
+      <w:proofErr w:type="gramEnd"/>
+      <w:r>
+        <w:rPr>
+          <w:lang w:val="en-PK"/>
+        </w:rPr>
+        <w:t xml:space="preserve"> map is like 1 -&gt; 3, 3</w:t>
+      </w:r>
+    </w:p>
+    <w:p>
+      <w:pPr>
+        <w:rPr>
+          <w:lang w:val="en-PK"/>
+        </w:rPr>
+      </w:pPr>
+    </w:p>
+    <w:p>
+      <w:pPr>
+        <w:rPr>
+          <w:lang w:val="en-PK"/>
+        </w:rPr>
+      </w:pPr>
+      <w:r>
+        <w:rPr>
+          <w:lang w:val="en-PK"/>
+        </w:rPr>
+        <w:t xml:space="preserve">        for (int </w:t>
+      </w:r>
+      <w:proofErr w:type="gramStart"/>
+      <w:r>
+        <w:rPr>
+          <w:lang w:val="en-PK"/>
+        </w:rPr>
+        <w:t>n :</w:t>
+      </w:r>
+      <w:proofErr w:type="gramEnd"/>
+      <w:r>
+        <w:rPr>
+          <w:lang w:val="en-PK"/>
+        </w:rPr>
+        <w:t xml:space="preserve"> nums2 ) {</w:t>
+      </w:r>
+    </w:p>
+    <w:p>
+      <w:pPr>
+        <w:rPr>
+          <w:lang w:val="en-PK"/>
+        </w:rPr>
+      </w:pPr>
+    </w:p>
+    <w:p>
+      <w:pPr>
+        <w:rPr>
+          <w:lang w:val="en-PK"/>
+        </w:rPr>
+      </w:pPr>
+      <w:r>
+        <w:rPr>
+          <w:lang w:val="en-PK"/>
+        </w:rPr>
+        <w:t>            while</w:t>
+      </w:r>
+      <w:proofErr w:type="gramStart"/>
+      <w:r>
+        <w:rPr>
+          <w:lang w:val="en-PK"/>
+        </w:rPr>
+        <w:t>(!</w:t>
+      </w:r>
+      <w:proofErr w:type="spellStart"/>
+      <w:r>
+        <w:rPr>
+          <w:lang w:val="en-PK"/>
+        </w:rPr>
+        <w:t>stack</w:t>
+      </w:r>
+      <w:proofErr w:type="gramEnd"/>
+      <w:r>
+        <w:rPr>
+          <w:lang w:val="en-PK"/>
+        </w:rPr>
+        <w:t>.isEmpty</w:t>
+      </w:r>
+      <w:proofErr w:type="spellEnd"/>
+      <w:r>
+        <w:rPr>
+          <w:lang w:val="en-PK"/>
+        </w:rPr>
+        <w:t xml:space="preserve">() &amp;&amp; n &gt; </w:t>
+      </w:r>
+      <w:proofErr w:type="spellStart"/>
+      <w:r>
+        <w:rPr>
+          <w:lang w:val="en-PK"/>
+        </w:rPr>
+        <w:t>stack.peek</w:t>
+      </w:r>
+      <w:proofErr w:type="spellEnd"/>
+      <w:r>
+        <w:rPr>
+          <w:lang w:val="en-PK"/>
+        </w:rPr>
+        <w:t>() ) {</w:t>
+      </w:r>
+    </w:p>
+    <w:p>
+      <w:pPr>
+        <w:rPr>
+          <w:lang w:val="en-PK"/>
+        </w:rPr>
+      </w:pPr>
+    </w:p>
+    <w:p>
+      <w:pPr>
+        <w:rPr>
+          <w:lang w:val="en-PK"/>
+        </w:rPr>
+      </w:pPr>
+      <w:r>
+        <w:rPr>
+          <w:lang w:val="en-PK"/>
+        </w:rPr>
+        <w:t xml:space="preserve">                </w:t>
+      </w:r>
+      <w:proofErr w:type="spellStart"/>
+      <w:proofErr w:type="gramStart"/>
+      <w:r>
+        <w:rPr>
+          <w:lang w:val="en-PK"/>
+        </w:rPr>
+        <w:t>map.put</w:t>
+      </w:r>
+      <w:proofErr w:type="spellEnd"/>
+      <w:r>
+        <w:rPr>
+          <w:lang w:val="en-PK"/>
+        </w:rPr>
+        <w:t xml:space="preserve">( </w:t>
+      </w:r>
+      <w:proofErr w:type="spellStart"/>
+      <w:r>
+        <w:rPr>
+          <w:lang w:val="en-PK"/>
+        </w:rPr>
+        <w:t>stack.pop</w:t>
+      </w:r>
+      <w:proofErr w:type="spellEnd"/>
+      <w:proofErr w:type="gramEnd"/>
+      <w:r>
+        <w:rPr>
+          <w:lang w:val="en-PK"/>
+        </w:rPr>
+        <w:t>(), n); // key - value</w:t>
+      </w:r>
+    </w:p>
+    <w:p>
+      <w:pPr>
+        <w:rPr>
+          <w:lang w:val="en-PK"/>
+        </w:rPr>
+      </w:pPr>
+      <w:r>
+        <w:rPr>
+          <w:lang w:val="en-PK"/>
+        </w:rPr>
+        <w:lastRenderedPageBreak/>
+        <w:t>            }</w:t>
+      </w:r>
+    </w:p>
+    <w:p>
+      <w:pPr>
+        <w:rPr>
+          <w:lang w:val="en-PK"/>
+        </w:rPr>
+      </w:pPr>
+      <w:r>
+        <w:rPr>
+          <w:lang w:val="en-PK"/>
+        </w:rPr>
+        <w:t>            // add in stack</w:t>
+      </w:r>
+    </w:p>
+    <w:p>
+      <w:pPr>
+        <w:rPr>
+          <w:lang w:val="en-PK"/>
+        </w:rPr>
+      </w:pPr>
+      <w:r>
+        <w:rPr>
+          <w:lang w:val="en-PK"/>
+        </w:rPr>
+        <w:t xml:space="preserve">            </w:t>
+      </w:r>
+      <w:proofErr w:type="spellStart"/>
+      <w:proofErr w:type="gramStart"/>
+      <w:r>
+        <w:rPr>
+          <w:lang w:val="en-PK"/>
+        </w:rPr>
+        <w:t>stack.push</w:t>
+      </w:r>
+      <w:proofErr w:type="spellEnd"/>
+      <w:proofErr w:type="gramEnd"/>
+      <w:r>
+        <w:rPr>
+          <w:lang w:val="en-PK"/>
+        </w:rPr>
+        <w:t>(n);</w:t>
+      </w:r>
+    </w:p>
+    <w:p>
+      <w:pPr>
+        <w:rPr>
+          <w:lang w:val="en-PK"/>
+        </w:rPr>
+      </w:pPr>
+    </w:p>
+    <w:p>
+      <w:pPr>
+        <w:rPr>
+          <w:lang w:val="en-PK"/>
+        </w:rPr>
+      </w:pPr>
+      <w:r>
+        <w:rPr>
+          <w:lang w:val="en-PK"/>
+        </w:rPr>
+        <w:t>        }</w:t>
+      </w:r>
+    </w:p>
+    <w:p>
+      <w:pPr>
+        <w:rPr>
+          <w:lang w:val="en-PK"/>
+        </w:rPr>
+      </w:pPr>
+    </w:p>
+    <w:p>
+      <w:pPr>
+        <w:rPr>
+          <w:lang w:val="en-PK"/>
+        </w:rPr>
+      </w:pPr>
+      <w:r>
+        <w:rPr>
+          <w:lang w:val="en-PK"/>
+        </w:rPr>
+        <w:t xml:space="preserve">        </w:t>
+      </w:r>
+      <w:proofErr w:type="spellStart"/>
+      <w:r>
+        <w:rPr>
+          <w:lang w:val="en-PK"/>
+        </w:rPr>
+        <w:t>System.out.println</w:t>
+      </w:r>
+      <w:proofErr w:type="spellEnd"/>
+      <w:r>
+        <w:rPr>
+          <w:lang w:val="en-PK"/>
+        </w:rPr>
+        <w:t>(map);</w:t>
+      </w:r>
+    </w:p>
+    <w:p>
+      <w:pPr>
+        <w:rPr>
+          <w:lang w:val="en-PK"/>
+        </w:rPr>
+      </w:pPr>
+    </w:p>
+    <w:p>
+      <w:pPr>
+        <w:rPr>
+          <w:lang w:val="en-PK"/>
+        </w:rPr>
+      </w:pPr>
+      <w:r>
+        <w:rPr>
+          <w:lang w:val="en-PK"/>
+        </w:rPr>
+        <w:t xml:space="preserve">        </w:t>
+      </w:r>
+      <w:proofErr w:type="gramStart"/>
+      <w:r>
+        <w:rPr>
+          <w:lang w:val="en-PK"/>
+        </w:rPr>
+        <w:t>for(</w:t>
+      </w:r>
+      <w:proofErr w:type="gramEnd"/>
+      <w:r>
+        <w:rPr>
+          <w:lang w:val="en-PK"/>
+        </w:rPr>
+        <w:t xml:space="preserve">int </w:t>
+      </w:r>
+      <w:proofErr w:type="spellStart"/>
+      <w:r>
+        <w:rPr>
+          <w:lang w:val="en-PK"/>
+        </w:rPr>
+        <w:t>i</w:t>
+      </w:r>
+      <w:proofErr w:type="spellEnd"/>
+      <w:r>
+        <w:rPr>
+          <w:lang w:val="en-PK"/>
+        </w:rPr>
+        <w:t xml:space="preserve">=0 ; </w:t>
+      </w:r>
+      <w:proofErr w:type="spellStart"/>
+      <w:r>
+        <w:rPr>
+          <w:lang w:val="en-PK"/>
+        </w:rPr>
+        <w:t>i</w:t>
+      </w:r>
+      <w:proofErr w:type="spellEnd"/>
+      <w:r>
+        <w:rPr>
+          <w:lang w:val="en-PK"/>
+        </w:rPr>
+        <w:t xml:space="preserve"> &lt; nums1.length ; </w:t>
+      </w:r>
+      <w:proofErr w:type="spellStart"/>
+      <w:r>
+        <w:rPr>
+          <w:lang w:val="en-PK"/>
+        </w:rPr>
+        <w:t>i</w:t>
+      </w:r>
+      <w:proofErr w:type="spellEnd"/>
+      <w:r>
+        <w:rPr>
+          <w:lang w:val="en-PK"/>
+        </w:rPr>
+        <w:t>+=1) {</w:t>
+      </w:r>
+    </w:p>
+    <w:p>
+      <w:pPr>
+        <w:rPr>
+          <w:lang w:val="en-PK"/>
+        </w:rPr>
+      </w:pPr>
+    </w:p>
+    <w:p>
+      <w:pPr>
+        <w:rPr>
+          <w:lang w:val="en-PK"/>
+        </w:rPr>
+      </w:pPr>
+      <w:r>
+        <w:rPr>
+          <w:lang w:val="en-PK"/>
+        </w:rPr>
+        <w:t>            nums1[</w:t>
+      </w:r>
+      <w:proofErr w:type="spellStart"/>
+      <w:r>
+        <w:rPr>
+          <w:lang w:val="en-PK"/>
+        </w:rPr>
+        <w:t>i</w:t>
+      </w:r>
+      <w:proofErr w:type="spellEnd"/>
+      <w:proofErr w:type="gramStart"/>
+      <w:r>
+        <w:rPr>
+          <w:lang w:val="en-PK"/>
+        </w:rPr>
+        <w:t>]  =</w:t>
+      </w:r>
+      <w:proofErr w:type="gramEnd"/>
+      <w:r>
+        <w:rPr>
+          <w:lang w:val="en-PK"/>
+        </w:rPr>
+        <w:t xml:space="preserve"> </w:t>
+      </w:r>
+      <w:proofErr w:type="spellStart"/>
+      <w:r>
+        <w:rPr>
+          <w:lang w:val="en-PK"/>
+        </w:rPr>
+        <w:t>map.getOrDefault</w:t>
+      </w:r>
+      <w:proofErr w:type="spellEnd"/>
+      <w:r>
+        <w:rPr>
+          <w:lang w:val="en-PK"/>
+        </w:rPr>
+        <w:t>( nums1[</w:t>
+      </w:r>
+      <w:proofErr w:type="spellStart"/>
+      <w:r>
+        <w:rPr>
+          <w:lang w:val="en-PK"/>
+        </w:rPr>
+        <w:t>i</w:t>
+      </w:r>
+      <w:proofErr w:type="spellEnd"/>
+      <w:r>
+        <w:rPr>
+          <w:lang w:val="en-PK"/>
+        </w:rPr>
+        <w:t>], -1 );</w:t>
+      </w:r>
+    </w:p>
+    <w:p>
+      <w:pPr>
+        <w:rPr>
+          <w:lang w:val="en-PK"/>
+        </w:rPr>
+      </w:pPr>
+      <w:r>
+        <w:rPr>
+          <w:lang w:val="en-PK"/>
+        </w:rPr>
+        <w:t>        }</w:t>
+      </w:r>
+    </w:p>
+    <w:p>
+      <w:pPr>
+        <w:rPr>
+          <w:lang w:val="en-PK"/>
+        </w:rPr>
+      </w:pPr>
+    </w:p>
+    <w:p>
+      <w:pPr>
+        <w:rPr>
+          <w:lang w:val="en-PK"/>
+        </w:rPr>
+      </w:pPr>
+      <w:r>
+        <w:rPr>
+          <w:lang w:val="en-PK"/>
+        </w:rPr>
+        <w:t>        return nums1;</w:t>
+      </w:r>
+    </w:p>
+    <w:p>
+      <w:pPr>
+        <w:rPr>
+          <w:lang w:val="en-PK"/>
+        </w:rPr>
+      </w:pPr>
+    </w:p>
+    <w:p>
+      <w:pPr>
+        <w:rPr>
+          <w:lang w:val="en-PK"/>
+        </w:rPr>
+      </w:pPr>
+      <w:r>
+        <w:rPr>
+          <w:lang w:val="en-PK"/>
+        </w:rPr>
+        <w:t xml:space="preserve">        </w:t>
+      </w:r>
+    </w:p>
+    <w:p>
+      <w:pPr>
+        <w:rPr>
+          <w:lang w:val="en-PK"/>
+        </w:rPr>
+      </w:pPr>
+      <w:r>
+        <w:rPr>
+          <w:lang w:val="en-PK"/>
+        </w:rPr>
+        <w:t>    }</w:t>
+      </w:r>
+    </w:p>
+    <w:p>
+      <w:pPr>
+        <w:rPr>
+          <w:lang w:val="en-PK"/>
+        </w:rPr>
+      </w:pPr>
+      <w:r>
+        <w:rPr>
+          <w:lang w:val="en-PK"/>
+        </w:rPr>
+        <w:t>}</w:t>
+      </w:r>
+    </w:p>
+    <w:p>
+      <w:pPr>
+        <w:rPr>
+          <w:lang w:val="en-PK"/>
+        </w:rPr>
+      </w:pPr>
+      <w:hyperlink r:id="rId13" w:history="1">
+        <w:r>
+          <w:rPr>
+            <w:rStyle w:val="Hyperlink"/>
+            <w:b/>
+            <w:bCs/>
+          </w:rPr>
+          <w:t>Daily Temperatures</w:t>
+        </w:r>
+      </w:hyperlink>
+    </w:p>
+    <w:p>
+      <w:pPr>
+        <w:rPr>
+          <w:lang w:val="en-PK"/>
+        </w:rPr>
+      </w:pPr>
+      <w:r>
+        <w:rPr>
+          <w:lang w:val="en-PK"/>
+        </w:rPr>
+        <w:t xml:space="preserve">As there </w:t>
+      </w:r>
+      <w:r>
+        <w:rPr>
+          <w:lang w:val="en-PK"/>
+        </w:rPr>
+        <w:t>are</w:t>
+      </w:r>
+      <w:r>
+        <w:rPr>
+          <w:lang w:val="en-PK"/>
+        </w:rPr>
+        <w:t xml:space="preserve"> duplicates, so think how can store in map?</w:t>
+      </w:r>
+      <w:r>
+        <w:rPr>
+          <w:lang w:val="en-PK"/>
+        </w:rPr>
+        <w:br/>
+        <w:t>Yes, using index as our concern is distance that is already done for each index so stor</w:t>
+      </w:r>
+      <w:r>
+        <w:rPr>
+          <w:lang w:val="en-PK"/>
+        </w:rPr>
+        <w:t>e index as a key.</w:t>
+      </w:r>
+    </w:p>
+    <w:p>
+      <w:pPr>
+        <w:rPr>
+          <w:lang w:val="en-PK"/>
+        </w:rPr>
+      </w:pPr>
+      <w:r>
+        <w:rPr>
+          <w:lang w:val="en-PK"/>
+        </w:rPr>
+        <w:t>class Solution {</w:t>
+      </w:r>
+    </w:p>
+    <w:p>
+      <w:pPr>
+        <w:rPr>
+          <w:lang w:val="en-PK"/>
+        </w:rPr>
+      </w:pPr>
+      <w:r>
+        <w:rPr>
+          <w:lang w:val="en-PK"/>
+        </w:rPr>
+        <w:t>    class Pair {</w:t>
+      </w:r>
+    </w:p>
+    <w:p>
+      <w:pPr>
+        <w:rPr>
+          <w:lang w:val="en-PK"/>
+        </w:rPr>
+      </w:pPr>
+      <w:r>
+        <w:rPr>
+          <w:lang w:val="en-PK"/>
+        </w:rPr>
+        <w:t>        Integer key;</w:t>
+      </w:r>
+    </w:p>
+    <w:p>
+      <w:pPr>
+        <w:rPr>
+          <w:lang w:val="en-PK"/>
+        </w:rPr>
+      </w:pPr>
+      <w:r>
+        <w:rPr>
+          <w:lang w:val="en-PK"/>
+        </w:rPr>
+        <w:t>        Integer value;</w:t>
+      </w:r>
+    </w:p>
+    <w:p>
+      <w:pPr>
+        <w:rPr>
+          <w:lang w:val="en-PK"/>
+        </w:rPr>
+      </w:pPr>
+    </w:p>
+    <w:p>
+      <w:pPr>
+        <w:rPr>
+          <w:lang w:val="en-PK"/>
+        </w:rPr>
+      </w:pPr>
+      <w:r>
+        <w:rPr>
+          <w:lang w:val="en-PK"/>
+        </w:rPr>
+        <w:t xml:space="preserve">        </w:t>
+      </w:r>
+      <w:proofErr w:type="gramStart"/>
+      <w:r>
+        <w:rPr>
+          <w:lang w:val="en-PK"/>
+        </w:rPr>
+        <w:t>Pair(</w:t>
+      </w:r>
+      <w:proofErr w:type="gramEnd"/>
+      <w:r>
+        <w:rPr>
+          <w:lang w:val="en-PK"/>
+        </w:rPr>
+        <w:t>Integer key, Integer value) {</w:t>
+      </w:r>
+    </w:p>
+    <w:p>
+      <w:pPr>
+        <w:rPr>
+          <w:lang w:val="en-PK"/>
+        </w:rPr>
+      </w:pPr>
+      <w:r>
+        <w:rPr>
+          <w:lang w:val="en-PK"/>
+        </w:rPr>
+        <w:t xml:space="preserve">            </w:t>
+      </w:r>
+      <w:proofErr w:type="spellStart"/>
+      <w:r>
+        <w:rPr>
+          <w:lang w:val="en-PK"/>
+        </w:rPr>
+        <w:t>this.key</w:t>
+      </w:r>
+      <w:proofErr w:type="spellEnd"/>
+      <w:r>
+        <w:rPr>
+          <w:lang w:val="en-PK"/>
+        </w:rPr>
+        <w:t xml:space="preserve"> = key;</w:t>
+      </w:r>
+    </w:p>
+    <w:p>
+      <w:pPr>
+        <w:rPr>
+          <w:lang w:val="en-PK"/>
+        </w:rPr>
+      </w:pPr>
+      <w:r>
+        <w:rPr>
+          <w:lang w:val="en-PK"/>
+        </w:rPr>
+        <w:t xml:space="preserve">            </w:t>
+      </w:r>
+      <w:proofErr w:type="spellStart"/>
+      <w:r>
+        <w:rPr>
+          <w:lang w:val="en-PK"/>
+        </w:rPr>
+        <w:t>this.value</w:t>
+      </w:r>
+      <w:proofErr w:type="spellEnd"/>
+      <w:r>
+        <w:rPr>
+          <w:lang w:val="en-PK"/>
+        </w:rPr>
+        <w:t xml:space="preserve"> = value;</w:t>
+      </w:r>
+    </w:p>
+    <w:p>
+      <w:pPr>
+        <w:rPr>
+          <w:lang w:val="en-PK"/>
+        </w:rPr>
+      </w:pPr>
+      <w:r>
+        <w:rPr>
+          <w:lang w:val="en-PK"/>
+        </w:rPr>
+        <w:t>        }</w:t>
+      </w:r>
+    </w:p>
+    <w:p>
+      <w:pPr>
+        <w:rPr>
+          <w:lang w:val="en-PK"/>
+        </w:rPr>
+      </w:pPr>
+      <w:r>
+        <w:rPr>
+          <w:lang w:val="en-PK"/>
+        </w:rPr>
+        <w:lastRenderedPageBreak/>
+        <w:t>    }</w:t>
+      </w:r>
+    </w:p>
+    <w:p>
+      <w:pPr>
+        <w:rPr>
+          <w:lang w:val="en-PK"/>
+        </w:rPr>
+      </w:pPr>
+      <w:r>
+        <w:rPr>
+          <w:lang w:val="en-PK"/>
+        </w:rPr>
+        <w:t>    // Don't use numbers as a key</w:t>
+      </w:r>
+    </w:p>
+    <w:p>
+      <w:pPr>
+        <w:rPr>
+          <w:lang w:val="en-PK"/>
+        </w:rPr>
+      </w:pPr>
+      <w:r>
+        <w:rPr>
+          <w:lang w:val="en-PK"/>
+        </w:rPr>
+        <w:t>    // Use index as a key</w:t>
+      </w:r>
+    </w:p>
+    <w:p>
+      <w:pPr>
+        <w:rPr>
+          <w:lang w:val="en-PK"/>
+        </w:rPr>
+      </w:pPr>
+    </w:p>
+    <w:p>
+      <w:pPr>
+        <w:rPr>
+          <w:lang w:val="en-PK"/>
+        </w:rPr>
+      </w:pPr>
+      <w:r>
+        <w:rPr>
+          <w:lang w:val="en-PK"/>
+        </w:rPr>
+        <w:t xml:space="preserve">    public </w:t>
+      </w:r>
+      <w:proofErr w:type="gramStart"/>
+      <w:r>
+        <w:rPr>
+          <w:lang w:val="en-PK"/>
+        </w:rPr>
+        <w:t>int[</w:t>
+      </w:r>
+      <w:proofErr w:type="gramEnd"/>
+      <w:r>
+        <w:rPr>
+          <w:lang w:val="en-PK"/>
+        </w:rPr>
+        <w:t xml:space="preserve">] </w:t>
+      </w:r>
+      <w:proofErr w:type="spellStart"/>
+      <w:r>
+        <w:rPr>
+          <w:lang w:val="en-PK"/>
+        </w:rPr>
+        <w:t>dailyTemperatures</w:t>
+      </w:r>
+      <w:proofErr w:type="spellEnd"/>
+      <w:r>
+        <w:rPr>
+          <w:lang w:val="en-PK"/>
+        </w:rPr>
+        <w:t>(int[] temperatures) {</w:t>
+      </w:r>
+    </w:p>
+    <w:p>
+      <w:pPr>
+        <w:rPr>
+          <w:lang w:val="en-PK"/>
+        </w:rPr>
+      </w:pPr>
+    </w:p>
+    <w:p>
+      <w:pPr>
+        <w:rPr>
+          <w:lang w:val="en-PK"/>
+        </w:rPr>
+      </w:pPr>
+      <w:r>
+        <w:rPr>
+          <w:lang w:val="en-PK"/>
+        </w:rPr>
+        <w:t>        Stack&lt;Pair&gt; stack = new Stack&lt;Pair</w:t>
+      </w:r>
+      <w:proofErr w:type="gramStart"/>
+      <w:r>
+        <w:rPr>
+          <w:lang w:val="en-PK"/>
+        </w:rPr>
+        <w:t>&gt;(</w:t>
+      </w:r>
+      <w:proofErr w:type="gramEnd"/>
+      <w:r>
+        <w:rPr>
+          <w:lang w:val="en-PK"/>
+        </w:rPr>
+        <w:t>);</w:t>
+      </w:r>
+    </w:p>
+    <w:p>
+      <w:pPr>
+        <w:rPr>
+          <w:lang w:val="en-PK"/>
+        </w:rPr>
+      </w:pPr>
+      <w:r>
+        <w:rPr>
+          <w:lang w:val="en-PK"/>
+        </w:rPr>
+        <w:t>        Map&lt;</w:t>
+      </w:r>
+      <w:proofErr w:type="spellStart"/>
+      <w:proofErr w:type="gramStart"/>
+      <w:r>
+        <w:rPr>
+          <w:lang w:val="en-PK"/>
+        </w:rPr>
+        <w:t>Integer,Integer</w:t>
+      </w:r>
+      <w:proofErr w:type="spellEnd"/>
+      <w:proofErr w:type="gramEnd"/>
+      <w:r>
+        <w:rPr>
+          <w:lang w:val="en-PK"/>
+        </w:rPr>
+        <w:t>&gt; map = new HashMap&lt;</w:t>
+      </w:r>
+      <w:proofErr w:type="spellStart"/>
+      <w:r>
+        <w:rPr>
+          <w:lang w:val="en-PK"/>
+        </w:rPr>
+        <w:t>Integer,Integer</w:t>
+      </w:r>
+      <w:proofErr w:type="spellEnd"/>
+      <w:r>
+        <w:rPr>
+          <w:lang w:val="en-PK"/>
+        </w:rPr>
+        <w:t>&gt;();</w:t>
+      </w:r>
+    </w:p>
+    <w:p>
+      <w:pPr>
+        <w:rPr>
+          <w:lang w:val="en-PK"/>
+        </w:rPr>
+      </w:pPr>
+      <w:r>
+        <w:rPr>
+          <w:lang w:val="en-PK"/>
+        </w:rPr>
+        <w:t xml:space="preserve">        int </w:t>
+      </w:r>
+      <w:proofErr w:type="gramStart"/>
+      <w:r>
+        <w:rPr>
+          <w:lang w:val="en-PK"/>
+        </w:rPr>
+        <w:t>n  =</w:t>
+      </w:r>
+      <w:proofErr w:type="gramEnd"/>
+      <w:r>
+        <w:rPr>
+          <w:lang w:val="en-PK"/>
+        </w:rPr>
+        <w:t xml:space="preserve"> </w:t>
+      </w:r>
+      <w:proofErr w:type="spellStart"/>
+      <w:r>
+        <w:rPr>
+          <w:lang w:val="en-PK"/>
+        </w:rPr>
+        <w:t>temperatures.length</w:t>
+      </w:r>
+      <w:proofErr w:type="spellEnd"/>
+      <w:r>
+        <w:rPr>
+          <w:lang w:val="en-PK"/>
+        </w:rPr>
+        <w:t>;</w:t>
+      </w:r>
+    </w:p>
+    <w:p>
+      <w:pPr>
+        <w:rPr>
+          <w:lang w:val="en-PK"/>
+        </w:rPr>
+      </w:pPr>
+    </w:p>
+    <w:p>
+      <w:pPr>
+        <w:rPr>
+          <w:lang w:val="en-PK"/>
+        </w:rPr>
+      </w:pPr>
+      <w:r>
+        <w:rPr>
+          <w:lang w:val="en-PK"/>
+        </w:rPr>
+        <w:t xml:space="preserve">        </w:t>
+      </w:r>
+      <w:proofErr w:type="gramStart"/>
+      <w:r>
+        <w:rPr>
+          <w:lang w:val="en-PK"/>
+        </w:rPr>
+        <w:t>for(</w:t>
+      </w:r>
+      <w:proofErr w:type="gramEnd"/>
+      <w:r>
+        <w:rPr>
+          <w:lang w:val="en-PK"/>
+        </w:rPr>
+        <w:t xml:space="preserve">int </w:t>
+      </w:r>
+      <w:proofErr w:type="spellStart"/>
+      <w:r>
+        <w:rPr>
+          <w:lang w:val="en-PK"/>
+        </w:rPr>
+        <w:t>i</w:t>
+      </w:r>
+      <w:proofErr w:type="spellEnd"/>
+      <w:r>
+        <w:rPr>
+          <w:lang w:val="en-PK"/>
+        </w:rPr>
+        <w:t xml:space="preserve"> =0;  </w:t>
+      </w:r>
+      <w:proofErr w:type="spellStart"/>
+      <w:r>
+        <w:rPr>
+          <w:lang w:val="en-PK"/>
+        </w:rPr>
+        <w:t>i</w:t>
+      </w:r>
+      <w:proofErr w:type="spellEnd"/>
+      <w:r>
+        <w:rPr>
+          <w:lang w:val="en-PK"/>
+        </w:rPr>
+        <w:t xml:space="preserve"> &lt;  n; </w:t>
+      </w:r>
+      <w:proofErr w:type="spellStart"/>
+      <w:r>
+        <w:rPr>
+          <w:lang w:val="en-PK"/>
+        </w:rPr>
+        <w:t>i</w:t>
+      </w:r>
+      <w:proofErr w:type="spellEnd"/>
+      <w:r>
+        <w:rPr>
+          <w:lang w:val="en-PK"/>
+        </w:rPr>
+        <w:t xml:space="preserve"> +=1) {</w:t>
+      </w:r>
+    </w:p>
+    <w:p>
+      <w:pPr>
+        <w:rPr>
+          <w:lang w:val="en-PK"/>
+        </w:rPr>
+      </w:pPr>
+      <w:r>
+        <w:rPr>
+          <w:lang w:val="en-PK"/>
+        </w:rPr>
+        <w:t>            int temp = temperatures[</w:t>
+      </w:r>
+      <w:proofErr w:type="spellStart"/>
+      <w:r>
+        <w:rPr>
+          <w:lang w:val="en-PK"/>
+        </w:rPr>
+        <w:t>i</w:t>
+      </w:r>
+      <w:proofErr w:type="spellEnd"/>
+      <w:r>
+        <w:rPr>
+          <w:lang w:val="en-PK"/>
+        </w:rPr>
+        <w:t>];</w:t>
+      </w:r>
+    </w:p>
+    <w:p>
+      <w:pPr>
+        <w:rPr>
+          <w:lang w:val="en-PK"/>
+        </w:rPr>
+      </w:pPr>
+    </w:p>
+    <w:p>
+      <w:pPr>
+        <w:rPr>
+          <w:lang w:val="en-PK"/>
+        </w:rPr>
+      </w:pPr>
+      <w:r>
+        <w:rPr>
+          <w:lang w:val="en-PK"/>
+        </w:rPr>
+        <w:t xml:space="preserve">            while </w:t>
+      </w:r>
+      <w:proofErr w:type="gramStart"/>
+      <w:r>
+        <w:rPr>
+          <w:lang w:val="en-PK"/>
+        </w:rPr>
+        <w:t>(!</w:t>
+      </w:r>
+      <w:proofErr w:type="spellStart"/>
+      <w:r>
+        <w:rPr>
+          <w:lang w:val="en-PK"/>
+        </w:rPr>
+        <w:t>stack</w:t>
+      </w:r>
+      <w:proofErr w:type="gramEnd"/>
+      <w:r>
+        <w:rPr>
+          <w:lang w:val="en-PK"/>
+        </w:rPr>
+        <w:t>.isEmpty</w:t>
+      </w:r>
+      <w:proofErr w:type="spellEnd"/>
+      <w:r>
+        <w:rPr>
+          <w:lang w:val="en-PK"/>
+        </w:rPr>
+        <w:t xml:space="preserve">() &amp;&amp; </w:t>
+      </w:r>
+      <w:proofErr w:type="spellStart"/>
+      <w:r>
+        <w:rPr>
+          <w:lang w:val="en-PK"/>
+        </w:rPr>
+        <w:t>stack.peek</w:t>
+      </w:r>
+      <w:proofErr w:type="spellEnd"/>
+      <w:r>
+        <w:rPr>
+          <w:lang w:val="en-PK"/>
+        </w:rPr>
+        <w:t>().key &lt; temp ){</w:t>
+      </w:r>
+    </w:p>
+    <w:p>
+      <w:pPr>
+        <w:rPr>
+          <w:lang w:val="en-PK"/>
+        </w:rPr>
+      </w:pPr>
+      <w:r>
+        <w:rPr>
+          <w:lang w:val="en-PK"/>
+        </w:rPr>
+        <w:t xml:space="preserve">                Pair popped = </w:t>
+      </w:r>
+      <w:proofErr w:type="spellStart"/>
+      <w:proofErr w:type="gramStart"/>
+      <w:r>
+        <w:rPr>
+          <w:lang w:val="en-PK"/>
+        </w:rPr>
+        <w:t>stack.pop</w:t>
+      </w:r>
+      <w:proofErr w:type="spellEnd"/>
+      <w:r>
+        <w:rPr>
+          <w:lang w:val="en-PK"/>
+        </w:rPr>
+        <w:t>(</w:t>
+      </w:r>
+      <w:proofErr w:type="gramEnd"/>
+      <w:r>
+        <w:rPr>
+          <w:lang w:val="en-PK"/>
+        </w:rPr>
+        <w:t>);</w:t>
+      </w:r>
+    </w:p>
+    <w:p>
+      <w:pPr>
+        <w:rPr>
+          <w:lang w:val="en-PK"/>
+        </w:rPr>
+      </w:pPr>
+      <w:r>
+        <w:rPr>
+          <w:lang w:val="en-PK"/>
+        </w:rPr>
+        <w:t xml:space="preserve">                int </w:t>
+      </w:r>
+      <w:proofErr w:type="spellStart"/>
+      <w:r>
+        <w:rPr>
+          <w:lang w:val="en-PK"/>
+        </w:rPr>
+        <w:t>poppedKey</w:t>
+      </w:r>
+      <w:proofErr w:type="spellEnd"/>
+      <w:r>
+        <w:rPr>
+          <w:lang w:val="en-PK"/>
+        </w:rPr>
+        <w:t xml:space="preserve"> = </w:t>
+      </w:r>
+      <w:proofErr w:type="spellStart"/>
+      <w:r>
+        <w:rPr>
+          <w:lang w:val="en-PK"/>
+        </w:rPr>
+        <w:t>popped.key</w:t>
+      </w:r>
+      <w:proofErr w:type="spellEnd"/>
+      <w:r>
+        <w:rPr>
+          <w:lang w:val="en-PK"/>
+        </w:rPr>
+        <w:t>;</w:t>
+      </w:r>
+    </w:p>
+    <w:p>
+      <w:pPr>
+        <w:rPr>
+          <w:lang w:val="en-PK"/>
+        </w:rPr>
+      </w:pPr>
+      <w:r>
+        <w:rPr>
+          <w:lang w:val="en-PK"/>
+        </w:rPr>
+        <w:t xml:space="preserve">                int </w:t>
+      </w:r>
+      <w:proofErr w:type="spellStart"/>
+      <w:r>
+        <w:rPr>
+          <w:lang w:val="en-PK"/>
+        </w:rPr>
+        <w:t>poppedIndex</w:t>
+      </w:r>
+      <w:proofErr w:type="spellEnd"/>
+      <w:r>
+        <w:rPr>
+          <w:lang w:val="en-PK"/>
+        </w:rPr>
+        <w:t xml:space="preserve"> = </w:t>
+      </w:r>
+      <w:proofErr w:type="spellStart"/>
+      <w:r>
+        <w:rPr>
+          <w:lang w:val="en-PK"/>
+        </w:rPr>
+        <w:t>popped.value</w:t>
+      </w:r>
+      <w:proofErr w:type="spellEnd"/>
+      <w:r>
+        <w:rPr>
+          <w:lang w:val="en-PK"/>
+        </w:rPr>
+        <w:t>;</w:t>
+      </w:r>
+    </w:p>
+    <w:p>
+      <w:pPr>
+        <w:rPr>
+          <w:lang w:val="en-PK"/>
+        </w:rPr>
+      </w:pPr>
+      <w:r>
+        <w:rPr>
+          <w:lang w:val="en-PK"/>
+        </w:rPr>
+        <w:t xml:space="preserve">                int distance = </w:t>
+      </w:r>
+      <w:proofErr w:type="spellStart"/>
+      <w:r>
+        <w:rPr>
+          <w:lang w:val="en-PK"/>
+        </w:rPr>
+        <w:t>i</w:t>
+      </w:r>
+      <w:proofErr w:type="spellEnd"/>
+      <w:r>
+        <w:rPr>
+          <w:lang w:val="en-PK"/>
+        </w:rPr>
+        <w:t xml:space="preserve"> - </w:t>
+      </w:r>
+      <w:proofErr w:type="spellStart"/>
+      <w:r>
+        <w:rPr>
+          <w:lang w:val="en-PK"/>
+        </w:rPr>
+        <w:t>poppedIndex</w:t>
+      </w:r>
+      <w:proofErr w:type="spellEnd"/>
+      <w:r>
+        <w:rPr>
+          <w:lang w:val="en-PK"/>
+        </w:rPr>
+        <w:t>;</w:t>
+      </w:r>
+    </w:p>
+    <w:p>
+      <w:pPr>
+        <w:rPr>
+          <w:lang w:val="en-PK"/>
+        </w:rPr>
+      </w:pPr>
+      <w:r>
+        <w:rPr>
+          <w:lang w:val="en-PK"/>
+        </w:rPr>
+        <w:t xml:space="preserve">                </w:t>
+      </w:r>
+      <w:proofErr w:type="spellStart"/>
+      <w:proofErr w:type="gramStart"/>
+      <w:r>
+        <w:rPr>
+          <w:lang w:val="en-PK"/>
+        </w:rPr>
+        <w:t>map.put</w:t>
+      </w:r>
+      <w:proofErr w:type="spellEnd"/>
+      <w:r>
+        <w:rPr>
+          <w:lang w:val="en-PK"/>
+        </w:rPr>
+        <w:t xml:space="preserve">( </w:t>
+      </w:r>
+      <w:proofErr w:type="spellStart"/>
+      <w:r>
+        <w:rPr>
+          <w:lang w:val="en-PK"/>
+        </w:rPr>
+        <w:t>poppedIndex</w:t>
+      </w:r>
+      <w:proofErr w:type="spellEnd"/>
+      <w:proofErr w:type="gramEnd"/>
+      <w:r>
+        <w:rPr>
+          <w:lang w:val="en-PK"/>
+        </w:rPr>
+        <w:t>, distance);</w:t>
+      </w:r>
+    </w:p>
+    <w:p>
+      <w:pPr>
+        <w:rPr>
+          <w:lang w:val="en-PK"/>
+        </w:rPr>
+      </w:pPr>
+      <w:r>
+        <w:rPr>
+          <w:lang w:val="en-PK"/>
+        </w:rPr>
+        <w:t>            }</w:t>
+      </w:r>
+    </w:p>
+    <w:p>
+      <w:pPr>
+        <w:rPr>
+          <w:lang w:val="en-PK"/>
+        </w:rPr>
+      </w:pPr>
+    </w:p>
+    <w:p>
+      <w:pPr>
+        <w:rPr>
+          <w:lang w:val="en-PK"/>
+        </w:rPr>
+      </w:pPr>
+      <w:r>
+        <w:rPr>
+          <w:lang w:val="en-PK"/>
+        </w:rPr>
+        <w:t xml:space="preserve">            </w:t>
+      </w:r>
+      <w:proofErr w:type="spellStart"/>
+      <w:proofErr w:type="gramStart"/>
+      <w:r>
+        <w:rPr>
+          <w:lang w:val="en-PK"/>
+        </w:rPr>
+        <w:t>stack.push</w:t>
+      </w:r>
+      <w:proofErr w:type="spellEnd"/>
+      <w:proofErr w:type="gramEnd"/>
+      <w:r>
+        <w:rPr>
+          <w:lang w:val="en-PK"/>
+        </w:rPr>
+        <w:t>( new Pair(</w:t>
+      </w:r>
+      <w:proofErr w:type="spellStart"/>
+      <w:r>
+        <w:rPr>
+          <w:lang w:val="en-PK"/>
+        </w:rPr>
+        <w:t>temp,i</w:t>
+      </w:r>
+      <w:proofErr w:type="spellEnd"/>
+      <w:r>
+        <w:rPr>
+          <w:lang w:val="en-PK"/>
+        </w:rPr>
+        <w:t>));</w:t>
+      </w:r>
+    </w:p>
+    <w:p>
+      <w:pPr>
+        <w:rPr>
+          <w:lang w:val="en-PK"/>
+        </w:rPr>
+      </w:pPr>
+      <w:r>
+        <w:rPr>
+          <w:lang w:val="en-PK"/>
+        </w:rPr>
+        <w:t>        }</w:t>
+      </w:r>
+    </w:p>
+    <w:p>
+      <w:pPr>
+        <w:rPr>
+          <w:lang w:val="en-PK"/>
+        </w:rPr>
+      </w:pPr>
+    </w:p>
+    <w:p>
+      <w:pPr>
+        <w:rPr>
+          <w:lang w:val="en-PK"/>
+        </w:rPr>
+      </w:pPr>
+      <w:r>
+        <w:rPr>
+          <w:lang w:val="en-PK"/>
+        </w:rPr>
+        <w:t xml:space="preserve">        </w:t>
+      </w:r>
+      <w:proofErr w:type="gramStart"/>
+      <w:r>
+        <w:rPr>
+          <w:lang w:val="en-PK"/>
+        </w:rPr>
+        <w:t>for(</w:t>
+      </w:r>
+      <w:proofErr w:type="gramEnd"/>
+      <w:r>
+        <w:rPr>
+          <w:lang w:val="en-PK"/>
+        </w:rPr>
+        <w:t xml:space="preserve">int </w:t>
+      </w:r>
+      <w:proofErr w:type="spellStart"/>
+      <w:r>
+        <w:rPr>
+          <w:lang w:val="en-PK"/>
+        </w:rPr>
+        <w:t>i</w:t>
+      </w:r>
+      <w:proofErr w:type="spellEnd"/>
+      <w:r>
+        <w:rPr>
+          <w:lang w:val="en-PK"/>
+        </w:rPr>
+        <w:t xml:space="preserve">=0; </w:t>
+      </w:r>
+      <w:proofErr w:type="spellStart"/>
+      <w:r>
+        <w:rPr>
+          <w:lang w:val="en-PK"/>
+        </w:rPr>
+        <w:t>i</w:t>
+      </w:r>
+      <w:proofErr w:type="spellEnd"/>
+      <w:r>
+        <w:rPr>
+          <w:lang w:val="en-PK"/>
+        </w:rPr>
+        <w:t xml:space="preserve">&lt;n ; </w:t>
+      </w:r>
+      <w:proofErr w:type="spellStart"/>
+      <w:r>
+        <w:rPr>
+          <w:lang w:val="en-PK"/>
+        </w:rPr>
+        <w:t>i</w:t>
+      </w:r>
+      <w:proofErr w:type="spellEnd"/>
+      <w:r>
+        <w:rPr>
+          <w:lang w:val="en-PK"/>
+        </w:rPr>
+        <w:t>+=1){</w:t>
+      </w:r>
+    </w:p>
+    <w:p>
+      <w:pPr>
+        <w:rPr>
+          <w:lang w:val="en-PK"/>
+        </w:rPr>
+      </w:pPr>
+      <w:r>
+        <w:rPr>
+          <w:lang w:val="en-PK"/>
+        </w:rPr>
+        <w:t>            temperatures[</w:t>
+      </w:r>
+      <w:proofErr w:type="spellStart"/>
+      <w:r>
+        <w:rPr>
+          <w:lang w:val="en-PK"/>
+        </w:rPr>
+        <w:t>i</w:t>
+      </w:r>
+      <w:proofErr w:type="spellEnd"/>
+      <w:r>
+        <w:rPr>
+          <w:lang w:val="en-PK"/>
+        </w:rPr>
+        <w:t xml:space="preserve">] = </w:t>
+      </w:r>
+      <w:proofErr w:type="spellStart"/>
+      <w:proofErr w:type="gramStart"/>
+      <w:r>
+        <w:rPr>
+          <w:lang w:val="en-PK"/>
+        </w:rPr>
+        <w:t>map.getOrDefault</w:t>
+      </w:r>
+      <w:proofErr w:type="spellEnd"/>
+      <w:proofErr w:type="gramEnd"/>
+      <w:r>
+        <w:rPr>
+          <w:lang w:val="en-PK"/>
+        </w:rPr>
+        <w:t>(</w:t>
+      </w:r>
+      <w:proofErr w:type="spellStart"/>
+      <w:r>
+        <w:rPr>
+          <w:lang w:val="en-PK"/>
+        </w:rPr>
+        <w:t>i</w:t>
+      </w:r>
+      <w:proofErr w:type="spellEnd"/>
+      <w:r>
+        <w:rPr>
+          <w:lang w:val="en-PK"/>
+        </w:rPr>
+        <w:t xml:space="preserve"> , 0);</w:t>
+      </w:r>
+    </w:p>
+    <w:p>
+      <w:pPr>
+        <w:rPr>
+          <w:lang w:val="en-PK"/>
+        </w:rPr>
+      </w:pPr>
+      <w:r>
+        <w:rPr>
+          <w:lang w:val="en-PK"/>
+        </w:rPr>
+        <w:t>        }</w:t>
+      </w:r>
+    </w:p>
+    <w:p>
+      <w:pPr>
+        <w:rPr>
+          <w:lang w:val="en-PK"/>
+        </w:rPr>
+      </w:pPr>
+    </w:p>
+    <w:p>
+      <w:pPr>
+        <w:rPr>
+          <w:lang w:val="en-PK"/>
+        </w:rPr>
+      </w:pPr>
+      <w:r>
+        <w:rPr>
+          <w:lang w:val="en-PK"/>
+        </w:rPr>
+        <w:t>        return temperatures;</w:t>
+      </w:r>
+    </w:p>
+    <w:p>
+      <w:pPr>
+        <w:rPr>
+          <w:lang w:val="en-PK"/>
+        </w:rPr>
+      </w:pPr>
+      <w:r>
+        <w:rPr>
+          <w:lang w:val="en-PK"/>
+        </w:rPr>
+        <w:t xml:space="preserve">        </w:t>
+      </w:r>
+    </w:p>
+    <w:p>
+      <w:pPr>
+        <w:rPr>
+          <w:lang w:val="en-PK"/>
+        </w:rPr>
+      </w:pPr>
+      <w:r>
+        <w:rPr>
+          <w:lang w:val="en-PK"/>
+        </w:rPr>
+        <w:lastRenderedPageBreak/>
+        <w:t>    }</w:t>
+      </w:r>
+    </w:p>
+    <w:p>
+      <w:pPr>
+        <w:rPr>
+          <w:lang w:val="en-PK"/>
+        </w:rPr>
+      </w:pPr>
+      <w:r>
+        <w:rPr>
+          <w:lang w:val="en-PK"/>
+        </w:rPr>
+        <w:t>}</w:t>
+      </w:r>
+    </w:p>
+    <w:p>
+      <w:pPr>
+        <w:rPr>
+          <w:lang w:val="en-PK"/>
+        </w:rPr>
+      </w:pPr>
+    </w:p>
+    <w:p>
+      <w:pPr>
+        <w:rPr>
+          <w:lang w:val="en-PK"/>
+        </w:rPr>
+      </w:pPr>
     </w:p>
     <w:p>
       <w:pPr>

</xml_diff>

<commit_message>
two pointers revise + monotonic stack
</commit_message>
<xml_diff>
--- a/Stack.docx
+++ b/Stack.docx
@@ -257,7 +257,21 @@
         <w:rPr>
           <w:lang w:val="en-PK"/>
         </w:rPr>
-        <w:t>            {  // top and second</w:t>
+        <w:t xml:space="preserve">            </w:t>
+      </w:r>
+      <w:proofErr w:type="gramStart"/>
+      <w:r>
+        <w:rPr>
+          <w:lang w:val="en-PK"/>
+        </w:rPr>
+        <w:t>{  /</w:t>
+      </w:r>
+      <w:proofErr w:type="gramEnd"/>
+      <w:r>
+        <w:rPr>
+          <w:lang w:val="en-PK"/>
+        </w:rPr>
+        <w:t>/ top and second</w:t>
       </w:r>
     </w:p>
     <w:p>
@@ -280,6 +294,7 @@
         <w:t xml:space="preserve">                int top = </w:t>
       </w:r>
       <w:proofErr w:type="spellStart"/>
+      <w:proofErr w:type="gramStart"/>
       <w:r>
         <w:rPr>
           <w:lang w:val="en-PK"/>
@@ -287,6 +302,7 @@
         <w:t>stack.peek</w:t>
       </w:r>
       <w:proofErr w:type="spellEnd"/>
+      <w:proofErr w:type="gramEnd"/>
       <w:r>
         <w:rPr>
           <w:lang w:val="en-PK"/>
@@ -332,6 +348,7 @@
         <w:t>(</w:t>
       </w:r>
       <w:proofErr w:type="spellStart"/>
+      <w:proofErr w:type="gramStart"/>
       <w:r>
         <w:rPr>
           <w:b/>
@@ -341,6 +358,7 @@
         <w:t>stack.size</w:t>
       </w:r>
       <w:proofErr w:type="spellEnd"/>
+      <w:proofErr w:type="gramEnd"/>
       <w:r>
         <w:rPr>
           <w:b/>
@@ -383,6 +401,7 @@
         <w:t xml:space="preserve">                </w:t>
       </w:r>
       <w:proofErr w:type="spellStart"/>
+      <w:proofErr w:type="gramStart"/>
       <w:r>
         <w:rPr>
           <w:lang w:val="en-PK"/>
@@ -390,6 +409,7 @@
         <w:t>stack.push</w:t>
       </w:r>
       <w:proofErr w:type="spellEnd"/>
+      <w:proofErr w:type="gramEnd"/>
       <w:r>
         <w:rPr>
           <w:lang w:val="en-PK"/>
@@ -437,6 +457,7 @@
         <w:t>            else if (</w:t>
       </w:r>
       <w:proofErr w:type="spellStart"/>
+      <w:proofErr w:type="gramStart"/>
       <w:r>
         <w:rPr>
           <w:lang w:val="en-PK"/>
@@ -444,6 +465,7 @@
         <w:t>str.equals</w:t>
       </w:r>
       <w:proofErr w:type="spellEnd"/>
+      <w:proofErr w:type="gramEnd"/>
       <w:r>
         <w:rPr>
           <w:lang w:val="en-PK"/>
@@ -477,6 +499,7 @@
         <w:t xml:space="preserve">                </w:t>
       </w:r>
       <w:proofErr w:type="spellStart"/>
+      <w:proofErr w:type="gramStart"/>
       <w:r>
         <w:rPr>
           <w:lang w:val="en-PK"/>
@@ -488,6 +511,116 @@
         <w:rPr>
           <w:lang w:val="en-PK"/>
         </w:rPr>
+        <w:t>(</w:t>
+      </w:r>
+      <w:proofErr w:type="gramEnd"/>
+      <w:r>
+        <w:rPr>
+          <w:lang w:val="en-PK"/>
+        </w:rPr>
+        <w:t>);</w:t>
+      </w:r>
+    </w:p>
+    <w:p>
+      <w:pPr>
+        <w:rPr>
+          <w:lang w:val="en-PK"/>
+        </w:rPr>
+      </w:pPr>
+      <w:r>
+        <w:rPr>
+          <w:lang w:val="en-PK"/>
+        </w:rPr>
+        <w:t>            }</w:t>
+      </w:r>
+    </w:p>
+    <w:p>
+      <w:pPr>
+        <w:rPr>
+          <w:lang w:val="en-PK"/>
+        </w:rPr>
+      </w:pPr>
+    </w:p>
+    <w:p>
+      <w:pPr>
+        <w:rPr>
+          <w:lang w:val="en-PK"/>
+        </w:rPr>
+      </w:pPr>
+      <w:r>
+        <w:rPr>
+          <w:lang w:val="en-PK"/>
+        </w:rPr>
+        <w:t xml:space="preserve">            else </w:t>
+      </w:r>
+      <w:proofErr w:type="gramStart"/>
+      <w:r>
+        <w:rPr>
+          <w:lang w:val="en-PK"/>
+        </w:rPr>
+        <w:t xml:space="preserve">if( </w:t>
+      </w:r>
+      <w:proofErr w:type="spellStart"/>
+      <w:r>
+        <w:rPr>
+          <w:lang w:val="en-PK"/>
+        </w:rPr>
+        <w:t>str</w:t>
+      </w:r>
+      <w:proofErr w:type="gramEnd"/>
+      <w:r>
+        <w:rPr>
+          <w:lang w:val="en-PK"/>
+        </w:rPr>
+        <w:t>.equals</w:t>
+      </w:r>
+      <w:proofErr w:type="spellEnd"/>
+      <w:r>
+        <w:rPr>
+          <w:lang w:val="en-PK"/>
+        </w:rPr>
+        <w:t>("D"))</w:t>
+      </w:r>
+    </w:p>
+    <w:p>
+      <w:pPr>
+        <w:rPr>
+          <w:lang w:val="en-PK"/>
+        </w:rPr>
+      </w:pPr>
+      <w:r>
+        <w:rPr>
+          <w:lang w:val="en-PK"/>
+        </w:rPr>
+        <w:t>            {</w:t>
+      </w:r>
+    </w:p>
+    <w:p>
+      <w:pPr>
+        <w:rPr>
+          <w:lang w:val="en-PK"/>
+        </w:rPr>
+      </w:pPr>
+      <w:r>
+        <w:rPr>
+          <w:lang w:val="en-PK"/>
+        </w:rPr>
+        <w:t xml:space="preserve">                int peek = </w:t>
+      </w:r>
+      <w:proofErr w:type="spellStart"/>
+      <w:proofErr w:type="gramStart"/>
+      <w:r>
+        <w:rPr>
+          <w:lang w:val="en-PK"/>
+        </w:rPr>
+        <w:t>stack.peek</w:t>
+      </w:r>
+      <w:proofErr w:type="spellEnd"/>
+      <w:proofErr w:type="gramEnd"/>
+      <w:r>
+        <w:rPr>
+          <w:lang w:val="en-PK"/>
+        </w:rPr>
         <w:t>();</w:t>
       </w:r>
     </w:p>
@@ -501,6 +634,55 @@
         <w:rPr>
           <w:lang w:val="en-PK"/>
         </w:rPr>
+        <w:t>                int res = peek * 2;</w:t>
+      </w:r>
+    </w:p>
+    <w:p>
+      <w:pPr>
+        <w:rPr>
+          <w:lang w:val="en-PK"/>
+        </w:rPr>
+      </w:pPr>
+    </w:p>
+    <w:p>
+      <w:pPr>
+        <w:rPr>
+          <w:lang w:val="en-PK"/>
+        </w:rPr>
+      </w:pPr>
+      <w:r>
+        <w:rPr>
+          <w:lang w:val="en-PK"/>
+        </w:rPr>
+        <w:t xml:space="preserve">                </w:t>
+      </w:r>
+      <w:proofErr w:type="spellStart"/>
+      <w:proofErr w:type="gramStart"/>
+      <w:r>
+        <w:rPr>
+          <w:lang w:val="en-PK"/>
+        </w:rPr>
+        <w:t>stack.push</w:t>
+      </w:r>
+      <w:proofErr w:type="spellEnd"/>
+      <w:proofErr w:type="gramEnd"/>
+      <w:r>
+        <w:rPr>
+          <w:lang w:val="en-PK"/>
+        </w:rPr>
+        <w:t>(res);</w:t>
+      </w:r>
+    </w:p>
+    <w:p>
+      <w:pPr>
+        <w:rPr>
+          <w:lang w:val="en-PK"/>
+        </w:rPr>
+      </w:pPr>
+      <w:r>
+        <w:rPr>
+          <w:lang w:val="en-PK"/>
+        </w:rPr>
         <w:t>            }</w:t>
       </w:r>
     </w:p>
@@ -521,21 +703,20 @@
         <w:rPr>
           <w:lang w:val="en-PK"/>
         </w:rPr>
-        <w:t xml:space="preserve">            else if( </w:t>
-      </w:r>
-      <w:proofErr w:type="spellStart"/>
-      <w:r>
-        <w:rPr>
-          <w:lang w:val="en-PK"/>
-        </w:rPr>
-        <w:t>str.equals</w:t>
-      </w:r>
-      <w:proofErr w:type="spellEnd"/>
-      <w:r>
-        <w:rPr>
-          <w:lang w:val="en-PK"/>
-        </w:rPr>
-        <w:t>("D"))</w:t>
+        <w:t xml:space="preserve">            else </w:t>
+      </w:r>
+    </w:p>
+    <w:p>
+      <w:pPr>
+        <w:rPr>
+          <w:lang w:val="en-PK"/>
+        </w:rPr>
+      </w:pPr>
+      <w:r>
+        <w:rPr>
+          <w:lang w:val="en-PK"/>
+        </w:rPr>
+        <w:t xml:space="preserve">            </w:t>
       </w:r>
     </w:p>
     <w:p>
@@ -561,56 +742,10 @@
         <w:rPr>
           <w:lang w:val="en-PK"/>
         </w:rPr>
-        <w:t xml:space="preserve">                int peek = </w:t>
-      </w:r>
-      <w:proofErr w:type="spellStart"/>
-      <w:r>
-        <w:rPr>
-          <w:lang w:val="en-PK"/>
-        </w:rPr>
-        <w:t>stack.peek</w:t>
-      </w:r>
-      <w:proofErr w:type="spellEnd"/>
-      <w:r>
-        <w:rPr>
-          <w:lang w:val="en-PK"/>
-        </w:rPr>
-        <w:t>();</w:t>
-      </w:r>
-    </w:p>
-    <w:p>
-      <w:pPr>
-        <w:rPr>
-          <w:lang w:val="en-PK"/>
-        </w:rPr>
-      </w:pPr>
-      <w:r>
-        <w:rPr>
-          <w:lang w:val="en-PK"/>
-        </w:rPr>
-        <w:t>                int res = peek * 2;</w:t>
-      </w:r>
-    </w:p>
-    <w:p>
-      <w:pPr>
-        <w:rPr>
-          <w:lang w:val="en-PK"/>
-        </w:rPr>
-      </w:pPr>
-    </w:p>
-    <w:p>
-      <w:pPr>
-        <w:rPr>
-          <w:lang w:val="en-PK"/>
-        </w:rPr>
-      </w:pPr>
-      <w:r>
-        <w:rPr>
-          <w:lang w:val="en-PK"/>
-        </w:rPr>
         <w:t xml:space="preserve">                </w:t>
       </w:r>
       <w:proofErr w:type="spellStart"/>
+      <w:proofErr w:type="gramStart"/>
       <w:r>
         <w:rPr>
           <w:lang w:val="en-PK"/>
@@ -618,11 +753,26 @@
         <w:t>stack.push</w:t>
       </w:r>
       <w:proofErr w:type="spellEnd"/>
-      <w:r>
-        <w:rPr>
-          <w:lang w:val="en-PK"/>
-        </w:rPr>
-        <w:t>(res);</w:t>
+      <w:proofErr w:type="gramEnd"/>
+      <w:r>
+        <w:rPr>
+          <w:lang w:val="en-PK"/>
+        </w:rPr>
+        <w:t>(</w:t>
+      </w:r>
+      <w:proofErr w:type="spellStart"/>
+      <w:r>
+        <w:rPr>
+          <w:lang w:val="en-PK"/>
+        </w:rPr>
+        <w:t>Integer.valueOf</w:t>
+      </w:r>
+      <w:proofErr w:type="spellEnd"/>
+      <w:r>
+        <w:rPr>
+          <w:lang w:val="en-PK"/>
+        </w:rPr>
+        <w:t>(str));</w:t>
       </w:r>
     </w:p>
     <w:p>
@@ -655,53 +805,76 @@
         <w:rPr>
           <w:lang w:val="en-PK"/>
         </w:rPr>
-        <w:t xml:space="preserve">            else </w:t>
-      </w:r>
-    </w:p>
-    <w:p>
-      <w:pPr>
-        <w:rPr>
-          <w:lang w:val="en-PK"/>
-        </w:rPr>
-      </w:pPr>
-      <w:r>
-        <w:rPr>
-          <w:lang w:val="en-PK"/>
-        </w:rPr>
-        <w:t xml:space="preserve">            </w:t>
-      </w:r>
-    </w:p>
-    <w:p>
-      <w:pPr>
-        <w:rPr>
-          <w:lang w:val="en-PK"/>
-        </w:rPr>
-      </w:pPr>
-      <w:r>
-        <w:rPr>
-          <w:lang w:val="en-PK"/>
-        </w:rPr>
-        <w:t>            {</w:t>
-      </w:r>
-    </w:p>
-    <w:p>
-      <w:pPr>
-        <w:rPr>
-          <w:lang w:val="en-PK"/>
-        </w:rPr>
-      </w:pPr>
-      <w:r>
-        <w:rPr>
-          <w:lang w:val="en-PK"/>
-        </w:rPr>
-        <w:t xml:space="preserve">                </w:t>
-      </w:r>
-      <w:proofErr w:type="spellStart"/>
-      <w:r>
-        <w:rPr>
-          <w:lang w:val="en-PK"/>
-        </w:rPr>
-        <w:t>stack.push</w:t>
+        <w:t>        }</w:t>
+      </w:r>
+    </w:p>
+    <w:p>
+      <w:pPr>
+        <w:rPr>
+          <w:lang w:val="en-PK"/>
+        </w:rPr>
+      </w:pPr>
+    </w:p>
+    <w:p>
+      <w:pPr>
+        <w:rPr>
+          <w:lang w:val="en-PK"/>
+        </w:rPr>
+      </w:pPr>
+      <w:r>
+        <w:rPr>
+          <w:lang w:val="en-PK"/>
+        </w:rPr>
+        <w:t>        while</w:t>
+      </w:r>
+      <w:proofErr w:type="gramStart"/>
+      <w:r>
+        <w:rPr>
+          <w:lang w:val="en-PK"/>
+        </w:rPr>
+        <w:t>(!</w:t>
+      </w:r>
+      <w:proofErr w:type="spellStart"/>
+      <w:r>
+        <w:rPr>
+          <w:lang w:val="en-PK"/>
+        </w:rPr>
+        <w:t>stack</w:t>
+      </w:r>
+      <w:proofErr w:type="gramEnd"/>
+      <w:r>
+        <w:rPr>
+          <w:lang w:val="en-PK"/>
+        </w:rPr>
+        <w:t>.isEmpty</w:t>
+      </w:r>
+      <w:proofErr w:type="spellEnd"/>
+      <w:r>
+        <w:rPr>
+          <w:lang w:val="en-PK"/>
+        </w:rPr>
+        <w:t>()){</w:t>
+      </w:r>
+    </w:p>
+    <w:p>
+      <w:pPr>
+        <w:rPr>
+          <w:lang w:val="en-PK"/>
+        </w:rPr>
+      </w:pPr>
+      <w:r>
+        <w:rPr>
+          <w:lang w:val="en-PK"/>
+        </w:rPr>
+        <w:t xml:space="preserve">            result += </w:t>
+      </w:r>
+      <w:proofErr w:type="spellStart"/>
+      <w:proofErr w:type="gramStart"/>
+      <w:r>
+        <w:rPr>
+          <w:lang w:val="en-PK"/>
+        </w:rPr>
+        <w:t>stack.pop</w:t>
       </w:r>
       <w:proofErr w:type="spellEnd"/>
       <w:r>
@@ -710,113 +883,12 @@
         </w:rPr>
         <w:t>(</w:t>
       </w:r>
-      <w:proofErr w:type="spellStart"/>
-      <w:r>
-        <w:rPr>
-          <w:lang w:val="en-PK"/>
-        </w:rPr>
-        <w:t>Integer.valueOf</w:t>
-      </w:r>
-      <w:proofErr w:type="spellEnd"/>
-      <w:r>
-        <w:rPr>
-          <w:lang w:val="en-PK"/>
-        </w:rPr>
-        <w:t>(str));</w:t>
-      </w:r>
-    </w:p>
-    <w:p>
-      <w:pPr>
-        <w:rPr>
-          <w:lang w:val="en-PK"/>
-        </w:rPr>
-      </w:pPr>
-      <w:r>
-        <w:rPr>
-          <w:lang w:val="en-PK"/>
-        </w:rPr>
-        <w:t>            }</w:t>
-      </w:r>
-    </w:p>
-    <w:p>
-      <w:pPr>
-        <w:rPr>
-          <w:lang w:val="en-PK"/>
-        </w:rPr>
-      </w:pPr>
-    </w:p>
-    <w:p>
-      <w:pPr>
-        <w:rPr>
-          <w:lang w:val="en-PK"/>
-        </w:rPr>
-      </w:pPr>
-      <w:r>
-        <w:rPr>
-          <w:lang w:val="en-PK"/>
-        </w:rPr>
-        <w:t>        }</w:t>
-      </w:r>
-    </w:p>
-    <w:p>
-      <w:pPr>
-        <w:rPr>
-          <w:lang w:val="en-PK"/>
-        </w:rPr>
-      </w:pPr>
-    </w:p>
-    <w:p>
-      <w:pPr>
-        <w:rPr>
-          <w:lang w:val="en-PK"/>
-        </w:rPr>
-      </w:pPr>
-      <w:r>
-        <w:rPr>
-          <w:lang w:val="en-PK"/>
-        </w:rPr>
-        <w:t>        while(!</w:t>
-      </w:r>
-      <w:proofErr w:type="spellStart"/>
-      <w:r>
-        <w:rPr>
-          <w:lang w:val="en-PK"/>
-        </w:rPr>
-        <w:t>stack.isEmpty</w:t>
-      </w:r>
-      <w:proofErr w:type="spellEnd"/>
-      <w:r>
-        <w:rPr>
-          <w:lang w:val="en-PK"/>
-        </w:rPr>
-        <w:t>()){</w:t>
-      </w:r>
-    </w:p>
-    <w:p>
-      <w:pPr>
-        <w:rPr>
-          <w:lang w:val="en-PK"/>
-        </w:rPr>
-      </w:pPr>
-      <w:r>
-        <w:rPr>
-          <w:lang w:val="en-PK"/>
-        </w:rPr>
-        <w:t xml:space="preserve">            result += </w:t>
-      </w:r>
-      <w:proofErr w:type="spellStart"/>
-      <w:r>
-        <w:rPr>
-          <w:lang w:val="en-PK"/>
-        </w:rPr>
-        <w:t>stack.pop</w:t>
-      </w:r>
-      <w:proofErr w:type="spellEnd"/>
-      <w:r>
-        <w:rPr>
-          <w:lang w:val="en-PK"/>
-        </w:rPr>
-        <w:t>();</w:t>
+      <w:proofErr w:type="gramEnd"/>
+      <w:r>
+        <w:rPr>
+          <w:lang w:val="en-PK"/>
+        </w:rPr>
+        <w:t>);</w:t>
       </w:r>
     </w:p>
     <w:p>
@@ -955,6 +1027,7 @@
         <w:t xml:space="preserve"> </w:t>
       </w:r>
       <w:proofErr w:type="spellStart"/>
+      <w:proofErr w:type="gramStart"/>
       <w:r>
         <w:rPr>
           <w:lang w:val="en-PK"/>
@@ -966,7 +1039,14 @@
         <w:rPr>
           <w:lang w:val="en-PK"/>
         </w:rPr>
-        <w:t>(String s) {</w:t>
+        <w:t>(</w:t>
+      </w:r>
+      <w:proofErr w:type="gramEnd"/>
+      <w:r>
+        <w:rPr>
+          <w:lang w:val="en-PK"/>
+        </w:rPr>
+        <w:t>String s) {</w:t>
       </w:r>
     </w:p>
     <w:p>
@@ -987,7 +1067,21 @@
           <w:lang w:val="en-PK"/>
         </w:rPr>
         <w:lastRenderedPageBreak/>
-        <w:t>        Stack&lt;Character&gt; stack = new Stack();</w:t>
+        <w:t xml:space="preserve">        Stack&lt;Character&gt; stack = new </w:t>
+      </w:r>
+      <w:proofErr w:type="gramStart"/>
+      <w:r>
+        <w:rPr>
+          <w:lang w:val="en-PK"/>
+        </w:rPr>
+        <w:t>Stack(</w:t>
+      </w:r>
+      <w:proofErr w:type="gramEnd"/>
+      <w:r>
+        <w:rPr>
+          <w:lang w:val="en-PK"/>
+        </w:rPr>
+        <w:t>);</w:t>
       </w:r>
     </w:p>
     <w:p>
@@ -1010,6 +1104,7 @@
         <w:t>        if(</w:t>
       </w:r>
       <w:proofErr w:type="spellStart"/>
+      <w:proofErr w:type="gramStart"/>
       <w:r>
         <w:rPr>
           <w:lang w:val="en-PK"/>
@@ -1017,6 +1112,7 @@
         <w:t>s.length</w:t>
       </w:r>
       <w:proofErr w:type="spellEnd"/>
+      <w:proofErr w:type="gramEnd"/>
       <w:r>
         <w:rPr>
           <w:lang w:val="en-PK"/>
@@ -1041,7 +1137,21 @@
         <w:rPr>
           <w:lang w:val="en-PK"/>
         </w:rPr>
-        <w:t xml:space="preserve">        for(char c : </w:t>
+        <w:t xml:space="preserve">        </w:t>
+      </w:r>
+      <w:proofErr w:type="gramStart"/>
+      <w:r>
+        <w:rPr>
+          <w:lang w:val="en-PK"/>
+        </w:rPr>
+        <w:t>for(</w:t>
+      </w:r>
+      <w:proofErr w:type="gramEnd"/>
+      <w:r>
+        <w:rPr>
+          <w:lang w:val="en-PK"/>
+        </w:rPr>
+        <w:t xml:space="preserve">char c : </w:t>
       </w:r>
       <w:proofErr w:type="spellStart"/>
       <w:r>
@@ -1075,7 +1185,21 @@
         <w:rPr>
           <w:lang w:val="en-PK"/>
         </w:rPr>
-        <w:t>            if( c=='(' || c=='{' || c=='[' )</w:t>
+        <w:t xml:space="preserve">            </w:t>
+      </w:r>
+      <w:proofErr w:type="gramStart"/>
+      <w:r>
+        <w:rPr>
+          <w:lang w:val="en-PK"/>
+        </w:rPr>
+        <w:t>if( c</w:t>
+      </w:r>
+      <w:proofErr w:type="gramEnd"/>
+      <w:r>
+        <w:rPr>
+          <w:lang w:val="en-PK"/>
+        </w:rPr>
+        <w:t>=='(' || c=='{' || c=='[' )</w:t>
       </w:r>
     </w:p>
     <w:p>
@@ -1104,6 +1228,7 @@
         <w:t xml:space="preserve">                </w:t>
       </w:r>
       <w:proofErr w:type="spellStart"/>
+      <w:proofErr w:type="gramStart"/>
       <w:r>
         <w:rPr>
           <w:lang w:val="en-PK"/>
@@ -1111,6 +1236,7 @@
         <w:t>stack.push</w:t>
       </w:r>
       <w:proofErr w:type="spellEnd"/>
+      <w:proofErr w:type="gramEnd"/>
       <w:r>
         <w:rPr>
           <w:lang w:val="en-PK"/>
@@ -1197,6 +1323,7 @@
         <w:t>                if(</w:t>
       </w:r>
       <w:proofErr w:type="spellStart"/>
+      <w:proofErr w:type="gramStart"/>
       <w:r>
         <w:rPr>
           <w:lang w:val="en-PK"/>
@@ -1204,6 +1331,7 @@
         <w:t>stack.isEmpty</w:t>
       </w:r>
       <w:proofErr w:type="spellEnd"/>
+      <w:proofErr w:type="gramEnd"/>
       <w:r>
         <w:rPr>
           <w:lang w:val="en-PK"/>
@@ -1231,6 +1359,7 @@
         <w:t xml:space="preserve">                char check = </w:t>
       </w:r>
       <w:proofErr w:type="spellStart"/>
+      <w:proofErr w:type="gramStart"/>
       <w:r>
         <w:rPr>
           <w:lang w:val="en-PK"/>
@@ -1242,27 +1371,48 @@
         <w:rPr>
           <w:lang w:val="en-PK"/>
         </w:rPr>
-        <w:t>();</w:t>
-      </w:r>
-    </w:p>
-    <w:p>
-      <w:pPr>
-        <w:rPr>
-          <w:lang w:val="en-PK"/>
-        </w:rPr>
-      </w:pPr>
-    </w:p>
-    <w:p>
-      <w:pPr>
-        <w:rPr>
-          <w:lang w:val="en-PK"/>
-        </w:rPr>
-      </w:pPr>
-      <w:r>
-        <w:rPr>
-          <w:lang w:val="en-PK"/>
-        </w:rPr>
-        <w:t>                if( c==')' &amp;&amp; check!='(' )</w:t>
+        <w:t>(</w:t>
+      </w:r>
+      <w:proofErr w:type="gramEnd"/>
+      <w:r>
+        <w:rPr>
+          <w:lang w:val="en-PK"/>
+        </w:rPr>
+        <w:t>);</w:t>
+      </w:r>
+    </w:p>
+    <w:p>
+      <w:pPr>
+        <w:rPr>
+          <w:lang w:val="en-PK"/>
+        </w:rPr>
+      </w:pPr>
+    </w:p>
+    <w:p>
+      <w:pPr>
+        <w:rPr>
+          <w:lang w:val="en-PK"/>
+        </w:rPr>
+      </w:pPr>
+      <w:r>
+        <w:rPr>
+          <w:lang w:val="en-PK"/>
+        </w:rPr>
+        <w:t xml:space="preserve">                </w:t>
+      </w:r>
+      <w:proofErr w:type="gramStart"/>
+      <w:r>
+        <w:rPr>
+          <w:lang w:val="en-PK"/>
+        </w:rPr>
+        <w:t>if( c</w:t>
+      </w:r>
+      <w:proofErr w:type="gramEnd"/>
+      <w:r>
+        <w:rPr>
+          <w:lang w:val="en-PK"/>
+        </w:rPr>
+        <w:t>==')' &amp;&amp; check!='(' )</w:t>
       </w:r>
     </w:p>
     <w:p>
@@ -1314,7 +1464,21 @@
         <w:rPr>
           <w:lang w:val="en-PK"/>
         </w:rPr>
-        <w:t>                  if( c=='}' &amp;&amp; check!='{' )</w:t>
+        <w:t xml:space="preserve">                  </w:t>
+      </w:r>
+      <w:proofErr w:type="gramStart"/>
+      <w:r>
+        <w:rPr>
+          <w:lang w:val="en-PK"/>
+        </w:rPr>
+        <w:t>if( c</w:t>
+      </w:r>
+      <w:proofErr w:type="gramEnd"/>
+      <w:r>
+        <w:rPr>
+          <w:lang w:val="en-PK"/>
+        </w:rPr>
+        <w:t>=='}' &amp;&amp; check!='{' )</w:t>
       </w:r>
     </w:p>
     <w:p>
@@ -1366,7 +1530,21 @@
         <w:rPr>
           <w:lang w:val="en-PK"/>
         </w:rPr>
-        <w:t>                  if( c==']' &amp;&amp; check!='[' )</w:t>
+        <w:t xml:space="preserve">                  </w:t>
+      </w:r>
+      <w:proofErr w:type="gramStart"/>
+      <w:r>
+        <w:rPr>
+          <w:lang w:val="en-PK"/>
+        </w:rPr>
+        <w:t>if( c</w:t>
+      </w:r>
+      <w:proofErr w:type="gramEnd"/>
+      <w:r>
+        <w:rPr>
+          <w:lang w:val="en-PK"/>
+        </w:rPr>
+        <w:t>==']' &amp;&amp; check!='[' )</w:t>
       </w:r>
     </w:p>
     <w:p>
@@ -1481,6 +1659,7 @@
         <w:t xml:space="preserve">        return </w:t>
       </w:r>
       <w:proofErr w:type="spellStart"/>
+      <w:proofErr w:type="gramStart"/>
       <w:r>
         <w:rPr>
           <w:lang w:val="en-PK"/>
@@ -1488,6 +1667,7 @@
         <w:t>stack.isEmpty</w:t>
       </w:r>
       <w:proofErr w:type="spellEnd"/>
+      <w:proofErr w:type="gramEnd"/>
       <w:r>
         <w:rPr>
           <w:lang w:val="en-PK"/>
@@ -1670,6 +1850,7 @@
         <w:t xml:space="preserve">    public </w:t>
       </w:r>
       <w:proofErr w:type="spellStart"/>
+      <w:proofErr w:type="gramStart"/>
       <w:r>
         <w:rPr>
           <w:lang w:val="en-PK"/>
@@ -1681,20 +1862,41 @@
         <w:rPr>
           <w:lang w:val="en-PK"/>
         </w:rPr>
-        <w:t>() {</w:t>
-      </w:r>
-    </w:p>
-    <w:p>
-      <w:pPr>
-        <w:rPr>
-          <w:lang w:val="en-PK"/>
-        </w:rPr>
-      </w:pPr>
-      <w:r>
-        <w:rPr>
-          <w:lang w:val="en-PK"/>
-        </w:rPr>
-        <w:t>        data =  new LinkedList&lt;&gt;();</w:t>
+        <w:t>(</w:t>
+      </w:r>
+      <w:proofErr w:type="gramEnd"/>
+      <w:r>
+        <w:rPr>
+          <w:lang w:val="en-PK"/>
+        </w:rPr>
+        <w:t>) {</w:t>
+      </w:r>
+    </w:p>
+    <w:p>
+      <w:pPr>
+        <w:rPr>
+          <w:lang w:val="en-PK"/>
+        </w:rPr>
+      </w:pPr>
+      <w:r>
+        <w:rPr>
+          <w:lang w:val="en-PK"/>
+        </w:rPr>
+        <w:t xml:space="preserve">        data </w:t>
+      </w:r>
+      <w:proofErr w:type="gramStart"/>
+      <w:r>
+        <w:rPr>
+          <w:lang w:val="en-PK"/>
+        </w:rPr>
+        <w:t>=  new</w:t>
+      </w:r>
+      <w:proofErr w:type="gramEnd"/>
+      <w:r>
+        <w:rPr>
+          <w:lang w:val="en-PK"/>
+        </w:rPr>
+        <w:t xml:space="preserve"> LinkedList&lt;&gt;();</w:t>
       </w:r>
     </w:p>
     <w:p>
@@ -1759,7 +1961,21 @@
         <w:rPr>
           <w:lang w:val="en-PK"/>
         </w:rPr>
-        <w:t>    public void push(int x) {</w:t>
+        <w:t xml:space="preserve">    public void </w:t>
+      </w:r>
+      <w:proofErr w:type="gramStart"/>
+      <w:r>
+        <w:rPr>
+          <w:lang w:val="en-PK"/>
+        </w:rPr>
+        <w:t>push(</w:t>
+      </w:r>
+      <w:proofErr w:type="gramEnd"/>
+      <w:r>
+        <w:rPr>
+          <w:lang w:val="en-PK"/>
+        </w:rPr>
+        <w:t>int x) {</w:t>
       </w:r>
     </w:p>
     <w:p>
@@ -1782,6 +1998,7 @@
         <w:t xml:space="preserve">        </w:t>
       </w:r>
       <w:proofErr w:type="spellStart"/>
+      <w:proofErr w:type="gramStart"/>
       <w:r>
         <w:rPr>
           <w:lang w:val="en-PK"/>
@@ -1789,6 +2006,7 @@
         <w:t>data.offer</w:t>
       </w:r>
       <w:proofErr w:type="spellEnd"/>
+      <w:proofErr w:type="gramEnd"/>
       <w:r>
         <w:rPr>
           <w:lang w:val="en-PK"/>
@@ -1859,7 +2077,21 @@
         <w:rPr>
           <w:lang w:val="en-PK"/>
         </w:rPr>
-        <w:t>    public int pop() {</w:t>
+        <w:t xml:space="preserve">    public int </w:t>
+      </w:r>
+      <w:proofErr w:type="gramStart"/>
+      <w:r>
+        <w:rPr>
+          <w:lang w:val="en-PK"/>
+        </w:rPr>
+        <w:t>pop(</w:t>
+      </w:r>
+      <w:proofErr w:type="gramEnd"/>
+      <w:r>
+        <w:rPr>
+          <w:lang w:val="en-PK"/>
+        </w:rPr>
+        <w:t>) {</w:t>
       </w:r>
     </w:p>
     <w:p>
@@ -1921,7 +2153,21 @@
         <w:rPr>
           <w:lang w:val="en-PK"/>
         </w:rPr>
-        <w:t>&lt;Integer&gt;();</w:t>
+        <w:t>&lt;Integer</w:t>
+      </w:r>
+      <w:proofErr w:type="gramStart"/>
+      <w:r>
+        <w:rPr>
+          <w:lang w:val="en-PK"/>
+        </w:rPr>
+        <w:t>&gt;(</w:t>
+      </w:r>
+      <w:proofErr w:type="gramEnd"/>
+      <w:r>
+        <w:rPr>
+          <w:lang w:val="en-PK"/>
+        </w:rPr>
+        <w:t>);</w:t>
       </w:r>
     </w:p>
     <w:p>
@@ -1966,14 +2212,28 @@
         <w:rPr>
           <w:lang w:val="en-PK"/>
         </w:rPr>
-        <w:t>        while(!</w:t>
-      </w:r>
-      <w:proofErr w:type="spellStart"/>
-      <w:r>
-        <w:rPr>
-          <w:lang w:val="en-PK"/>
-        </w:rPr>
-        <w:t>data.isEmpty</w:t>
+        <w:t>        while</w:t>
+      </w:r>
+      <w:proofErr w:type="gramStart"/>
+      <w:r>
+        <w:rPr>
+          <w:lang w:val="en-PK"/>
+        </w:rPr>
+        <w:t>(!</w:t>
+      </w:r>
+      <w:proofErr w:type="spellStart"/>
+      <w:r>
+        <w:rPr>
+          <w:lang w:val="en-PK"/>
+        </w:rPr>
+        <w:t>data</w:t>
+      </w:r>
+      <w:proofErr w:type="gramEnd"/>
+      <w:r>
+        <w:rPr>
+          <w:lang w:val="en-PK"/>
+        </w:rPr>
+        <w:t>.isEmpty</w:t>
       </w:r>
       <w:proofErr w:type="spellEnd"/>
       <w:r>
@@ -1996,6 +2256,7 @@
         <w:t xml:space="preserve">            int element = </w:t>
       </w:r>
       <w:proofErr w:type="spellStart"/>
+      <w:proofErr w:type="gramStart"/>
       <w:r>
         <w:rPr>
           <w:lang w:val="en-PK"/>
@@ -2003,6 +2264,7 @@
         <w:t>data.poll</w:t>
       </w:r>
       <w:proofErr w:type="spellEnd"/>
+      <w:proofErr w:type="gramEnd"/>
       <w:r>
         <w:rPr>
           <w:lang w:val="en-PK"/>
@@ -10553,6 +10815,578 @@
           <w:lang w:val="en-PK"/>
         </w:rPr>
         <w:t>}</w:t>
+      </w:r>
+    </w:p>
+    <w:p>
+      <w:pPr>
+        <w:rPr>
+          <w:lang w:val="en-PK"/>
+        </w:rPr>
+      </w:pPr>
+    </w:p>
+    <w:p>
+      <w:pPr>
+        <w:rPr>
+          <w:lang w:val="en-PK"/>
+        </w:rPr>
+      </w:pPr>
+      <w:hyperlink r:id="rId15" w:history="1">
+        <w:r>
+          <w:rPr>
+            <w:rStyle w:val="Hyperlink"/>
+            <w:b/>
+            <w:bCs/>
+          </w:rPr>
+          <w:t>Online Stock Span</w:t>
+        </w:r>
+      </w:hyperlink>
+    </w:p>
+    <w:p>
+      <w:pPr>
+        <w:rPr>
+          <w:lang w:val="en-PK"/>
+        </w:rPr>
+      </w:pPr>
+    </w:p>
+    <w:p>
+      <w:pPr>
+        <w:rPr>
+          <w:lang w:val="en-PK"/>
+        </w:rPr>
+      </w:pPr>
+      <w:r>
+        <w:rPr>
+          <w:lang w:val="en-PK"/>
+        </w:rPr>
+        <w:t>Next values less than key</w:t>
+      </w:r>
+    </w:p>
+    <w:p>
+      <w:pPr>
+        <w:rPr>
+          <w:lang w:val="en-PK"/>
+        </w:rPr>
+      </w:pPr>
+      <w:r>
+        <w:rPr>
+          <w:lang w:val="en-PK"/>
+        </w:rPr>
+        <w:t xml:space="preserve">class </w:t>
+      </w:r>
+      <w:proofErr w:type="spellStart"/>
+      <w:r>
+        <w:rPr>
+          <w:lang w:val="en-PK"/>
+        </w:rPr>
+        <w:t>StockSpanner</w:t>
+      </w:r>
+      <w:proofErr w:type="spellEnd"/>
+      <w:r>
+        <w:rPr>
+          <w:lang w:val="en-PK"/>
+        </w:rPr>
+        <w:t xml:space="preserve"> {</w:t>
+      </w:r>
+    </w:p>
+    <w:p>
+      <w:pPr>
+        <w:rPr>
+          <w:lang w:val="en-PK"/>
+        </w:rPr>
+      </w:pPr>
+    </w:p>
+    <w:p>
+      <w:pPr>
+        <w:rPr>
+          <w:lang w:val="en-PK"/>
+        </w:rPr>
+      </w:pPr>
+      <w:r>
+        <w:rPr>
+          <w:lang w:val="en-PK"/>
+        </w:rPr>
+        <w:t>   Stack&lt;int[]&gt; stack = new Stack&lt;&gt;();</w:t>
+      </w:r>
+    </w:p>
+    <w:p>
+      <w:pPr>
+        <w:rPr>
+          <w:lang w:val="en-PK"/>
+        </w:rPr>
+      </w:pPr>
+    </w:p>
+    <w:p>
+      <w:pPr>
+        <w:rPr>
+          <w:lang w:val="en-PK"/>
+        </w:rPr>
+      </w:pPr>
+      <w:r>
+        <w:rPr>
+          <w:lang w:val="en-PK"/>
+        </w:rPr>
+        <w:t xml:space="preserve">    public </w:t>
+      </w:r>
+      <w:proofErr w:type="spellStart"/>
+      <w:r>
+        <w:rPr>
+          <w:lang w:val="en-PK"/>
+        </w:rPr>
+        <w:t>StockSpanner</w:t>
+      </w:r>
+      <w:proofErr w:type="spellEnd"/>
+      <w:r>
+        <w:rPr>
+          <w:lang w:val="en-PK"/>
+        </w:rPr>
+        <w:t>() {</w:t>
+      </w:r>
+    </w:p>
+    <w:p>
+      <w:pPr>
+        <w:rPr>
+          <w:lang w:val="en-PK"/>
+        </w:rPr>
+      </w:pPr>
+      <w:r>
+        <w:rPr>
+          <w:lang w:val="en-PK"/>
+        </w:rPr>
+        <w:t>        stack = new Stack&lt;&gt;();</w:t>
+      </w:r>
+    </w:p>
+    <w:p>
+      <w:pPr>
+        <w:rPr>
+          <w:lang w:val="en-PK"/>
+        </w:rPr>
+      </w:pPr>
+      <w:r>
+        <w:rPr>
+          <w:lang w:val="en-PK"/>
+        </w:rPr>
+        <w:t xml:space="preserve">        </w:t>
+      </w:r>
+    </w:p>
+    <w:p>
+      <w:pPr>
+        <w:rPr>
+          <w:lang w:val="en-PK"/>
+        </w:rPr>
+      </w:pPr>
+      <w:r>
+        <w:rPr>
+          <w:lang w:val="en-PK"/>
+        </w:rPr>
+        <w:t>    }</w:t>
+      </w:r>
+    </w:p>
+    <w:p>
+      <w:pPr>
+        <w:rPr>
+          <w:lang w:val="en-PK"/>
+        </w:rPr>
+      </w:pPr>
+      <w:r>
+        <w:rPr>
+          <w:lang w:val="en-PK"/>
+        </w:rPr>
+        <w:t>    // key-value</w:t>
+      </w:r>
+    </w:p>
+    <w:p>
+      <w:pPr>
+        <w:rPr>
+          <w:lang w:val="en-PK"/>
+        </w:rPr>
+      </w:pPr>
+    </w:p>
+    <w:p>
+      <w:pPr>
+        <w:rPr>
+          <w:lang w:val="en-PK"/>
+        </w:rPr>
+      </w:pPr>
+      <w:r>
+        <w:rPr>
+          <w:lang w:val="en-PK"/>
+        </w:rPr>
+        <w:t>    // key price , res prices less than key, monotonic stack</w:t>
+      </w:r>
+    </w:p>
+    <w:p>
+      <w:pPr>
+        <w:rPr>
+          <w:lang w:val="en-PK"/>
+        </w:rPr>
+      </w:pPr>
+      <w:r>
+        <w:rPr>
+          <w:lang w:val="en-PK"/>
+        </w:rPr>
+        <w:t>    // next values less than key</w:t>
+      </w:r>
+    </w:p>
+    <w:p>
+      <w:pPr>
+        <w:rPr>
+          <w:lang w:val="en-PK"/>
+        </w:rPr>
+      </w:pPr>
+      <w:r>
+        <w:rPr>
+          <w:lang w:val="en-PK"/>
+        </w:rPr>
+        <w:t xml:space="preserve">    </w:t>
+      </w:r>
+    </w:p>
+    <w:p>
+      <w:pPr>
+        <w:rPr>
+          <w:lang w:val="en-PK"/>
+        </w:rPr>
+      </w:pPr>
+      <w:r>
+        <w:rPr>
+          <w:lang w:val="en-PK"/>
+        </w:rPr>
+        <w:t>    public int next(int price) {</w:t>
+      </w:r>
+    </w:p>
+    <w:p>
+      <w:pPr>
+        <w:rPr>
+          <w:lang w:val="en-PK"/>
+        </w:rPr>
+      </w:pPr>
+      <w:r>
+        <w:rPr>
+          <w:lang w:val="en-PK"/>
+        </w:rPr>
+        <w:t>        int res = 1;</w:t>
+      </w:r>
+    </w:p>
+    <w:p>
+      <w:pPr>
+        <w:rPr>
+          <w:lang w:val="en-PK"/>
+        </w:rPr>
+      </w:pPr>
+    </w:p>
+    <w:p>
+      <w:pPr>
+        <w:rPr>
+          <w:lang w:val="en-PK"/>
+        </w:rPr>
+      </w:pPr>
+      <w:r>
+        <w:rPr>
+          <w:lang w:val="en-PK"/>
+        </w:rPr>
+        <w:t>        while(  !</w:t>
+      </w:r>
+      <w:proofErr w:type="spellStart"/>
+      <w:r>
+        <w:rPr>
+          <w:lang w:val="en-PK"/>
+        </w:rPr>
+        <w:t>stack.isEmpty</w:t>
+      </w:r>
+      <w:proofErr w:type="spellEnd"/>
+      <w:r>
+        <w:rPr>
+          <w:lang w:val="en-PK"/>
+        </w:rPr>
+        <w:t xml:space="preserve">() &amp;&amp; </w:t>
+      </w:r>
+      <w:proofErr w:type="spellStart"/>
+      <w:r>
+        <w:rPr>
+          <w:lang w:val="en-PK"/>
+        </w:rPr>
+        <w:t>stack.peek</w:t>
+      </w:r>
+      <w:proofErr w:type="spellEnd"/>
+      <w:r>
+        <w:rPr>
+          <w:lang w:val="en-PK"/>
+        </w:rPr>
+        <w:t>()[0]  &lt;= price ){</w:t>
+      </w:r>
+    </w:p>
+    <w:p>
+      <w:pPr>
+        <w:rPr>
+          <w:lang w:val="en-PK"/>
+        </w:rPr>
+      </w:pPr>
+      <w:r>
+        <w:rPr>
+          <w:lang w:val="en-PK"/>
+        </w:rPr>
+        <w:t xml:space="preserve">            res += </w:t>
+      </w:r>
+      <w:proofErr w:type="spellStart"/>
+      <w:r>
+        <w:rPr>
+          <w:lang w:val="en-PK"/>
+        </w:rPr>
+        <w:t>stack.pop</w:t>
+      </w:r>
+      <w:proofErr w:type="spellEnd"/>
+      <w:r>
+        <w:rPr>
+          <w:lang w:val="en-PK"/>
+        </w:rPr>
+        <w:t>()[1];</w:t>
+      </w:r>
+    </w:p>
+    <w:p>
+      <w:pPr>
+        <w:rPr>
+          <w:lang w:val="en-PK"/>
+        </w:rPr>
+      </w:pPr>
+      <w:r>
+        <w:rPr>
+          <w:lang w:val="en-PK"/>
+        </w:rPr>
+        <w:t>        }</w:t>
+      </w:r>
+    </w:p>
+    <w:p>
+      <w:pPr>
+        <w:rPr>
+          <w:lang w:val="en-PK"/>
+        </w:rPr>
+      </w:pPr>
+    </w:p>
+    <w:p>
+      <w:pPr>
+        <w:rPr>
+          <w:lang w:val="en-PK"/>
+        </w:rPr>
+      </w:pPr>
+      <w:r>
+        <w:rPr>
+          <w:lang w:val="en-PK"/>
+        </w:rPr>
+        <w:t xml:space="preserve">        </w:t>
+      </w:r>
+      <w:proofErr w:type="spellStart"/>
+      <w:r>
+        <w:rPr>
+          <w:lang w:val="en-PK"/>
+        </w:rPr>
+        <w:t>stack.push</w:t>
+      </w:r>
+      <w:proofErr w:type="spellEnd"/>
+      <w:r>
+        <w:rPr>
+          <w:lang w:val="en-PK"/>
+        </w:rPr>
+        <w:t>(new int[]{</w:t>
+      </w:r>
+      <w:proofErr w:type="spellStart"/>
+      <w:r>
+        <w:rPr>
+          <w:lang w:val="en-PK"/>
+        </w:rPr>
+        <w:t>price,res</w:t>
+      </w:r>
+      <w:proofErr w:type="spellEnd"/>
+      <w:r>
+        <w:rPr>
+          <w:lang w:val="en-PK"/>
+        </w:rPr>
+        <w:t>});</w:t>
+      </w:r>
+    </w:p>
+    <w:p>
+      <w:pPr>
+        <w:rPr>
+          <w:lang w:val="en-PK"/>
+        </w:rPr>
+      </w:pPr>
+    </w:p>
+    <w:p>
+      <w:pPr>
+        <w:rPr>
+          <w:lang w:val="en-PK"/>
+        </w:rPr>
+      </w:pPr>
+      <w:r>
+        <w:rPr>
+          <w:lang w:val="en-PK"/>
+        </w:rPr>
+        <w:t>        return res;</w:t>
+      </w:r>
+    </w:p>
+    <w:p>
+      <w:pPr>
+        <w:rPr>
+          <w:lang w:val="en-PK"/>
+        </w:rPr>
+      </w:pPr>
+      <w:r>
+        <w:rPr>
+          <w:lang w:val="en-PK"/>
+        </w:rPr>
+        <w:t xml:space="preserve">        </w:t>
+      </w:r>
+    </w:p>
+    <w:p>
+      <w:pPr>
+        <w:rPr>
+          <w:lang w:val="en-PK"/>
+        </w:rPr>
+      </w:pPr>
+      <w:r>
+        <w:rPr>
+          <w:lang w:val="en-PK"/>
+        </w:rPr>
+        <w:t>    }</w:t>
+      </w:r>
+    </w:p>
+    <w:p>
+      <w:pPr>
+        <w:rPr>
+          <w:lang w:val="en-PK"/>
+        </w:rPr>
+      </w:pPr>
+      <w:r>
+        <w:rPr>
+          <w:lang w:val="en-PK"/>
+        </w:rPr>
+        <w:t>}</w:t>
+      </w:r>
+    </w:p>
+    <w:p>
+      <w:pPr>
+        <w:rPr>
+          <w:lang w:val="en-PK"/>
+        </w:rPr>
+      </w:pPr>
+    </w:p>
+    <w:p>
+      <w:pPr>
+        <w:rPr>
+          <w:lang w:val="en-PK"/>
+        </w:rPr>
+      </w:pPr>
+      <w:r>
+        <w:rPr>
+          <w:lang w:val="en-PK"/>
+        </w:rPr>
+        <w:t>/**</w:t>
+      </w:r>
+    </w:p>
+    <w:p>
+      <w:pPr>
+        <w:rPr>
+          <w:lang w:val="en-PK"/>
+        </w:rPr>
+      </w:pPr>
+      <w:r>
+        <w:rPr>
+          <w:lang w:val="en-PK"/>
+        </w:rPr>
+        <w:t xml:space="preserve"> * Your </w:t>
+      </w:r>
+      <w:proofErr w:type="spellStart"/>
+      <w:r>
+        <w:rPr>
+          <w:lang w:val="en-PK"/>
+        </w:rPr>
+        <w:t>StockSpanner</w:t>
+      </w:r>
+      <w:proofErr w:type="spellEnd"/>
+      <w:r>
+        <w:rPr>
+          <w:lang w:val="en-PK"/>
+        </w:rPr>
+        <w:t xml:space="preserve"> object will be instantiated and called as such:</w:t>
+      </w:r>
+    </w:p>
+    <w:p>
+      <w:pPr>
+        <w:rPr>
+          <w:lang w:val="en-PK"/>
+        </w:rPr>
+      </w:pPr>
+      <w:r>
+        <w:rPr>
+          <w:lang w:val="en-PK"/>
+        </w:rPr>
+        <w:t xml:space="preserve"> * </w:t>
+      </w:r>
+      <w:proofErr w:type="spellStart"/>
+      <w:r>
+        <w:rPr>
+          <w:lang w:val="en-PK"/>
+        </w:rPr>
+        <w:t>StockSpanner</w:t>
+      </w:r>
+      <w:proofErr w:type="spellEnd"/>
+      <w:r>
+        <w:rPr>
+          <w:lang w:val="en-PK"/>
+        </w:rPr>
+        <w:t xml:space="preserve"> obj = new </w:t>
+      </w:r>
+      <w:proofErr w:type="spellStart"/>
+      <w:r>
+        <w:rPr>
+          <w:lang w:val="en-PK"/>
+        </w:rPr>
+        <w:t>StockSpanner</w:t>
+      </w:r>
+      <w:proofErr w:type="spellEnd"/>
+      <w:r>
+        <w:rPr>
+          <w:lang w:val="en-PK"/>
+        </w:rPr>
+        <w:t>();</w:t>
+      </w:r>
+    </w:p>
+    <w:p>
+      <w:pPr>
+        <w:rPr>
+          <w:lang w:val="en-PK"/>
+        </w:rPr>
+      </w:pPr>
+      <w:r>
+        <w:rPr>
+          <w:lang w:val="en-PK"/>
+        </w:rPr>
+        <w:t xml:space="preserve"> * int param_1 = </w:t>
+      </w:r>
+      <w:proofErr w:type="spellStart"/>
+      <w:r>
+        <w:rPr>
+          <w:lang w:val="en-PK"/>
+        </w:rPr>
+        <w:t>obj.next</w:t>
+      </w:r>
+      <w:proofErr w:type="spellEnd"/>
+      <w:r>
+        <w:rPr>
+          <w:lang w:val="en-PK"/>
+        </w:rPr>
+        <w:t>(price);</w:t>
+      </w:r>
+    </w:p>
+    <w:p>
+      <w:pPr>
+        <w:rPr>
+          <w:lang w:val="en-PK"/>
+        </w:rPr>
+      </w:pPr>
+      <w:r>
+        <w:rPr>
+          <w:lang w:val="en-PK"/>
+        </w:rPr>
+        <w:t> */</w:t>
       </w:r>
     </w:p>
     <w:p>

</xml_diff>